<commit_message>
Incorporate detailed CV evidence and confirmed dissertation defense
</commit_message>
<xml_diff>
--- a/resumes/Samya_Samanta_Pfizer_Early_Formulation.docx
+++ b/resumes/Samya_Samanta_Pfizer_Early_Formulation.docx
@@ -195,34 +195,11 @@
       </w:pPr>
       <w:r>
         <w:rPr>
-          <w:rFonts w:eastAsia="Arial" w:cs="Arial"/>
-          <w:sz w:val="20"/>
-          <w:szCs w:val="20"/>
-          <w:color w:val="292D32"/>
-        </w:rPr>
-        <w:t>Thesis title:</w:t>
-      </w:r>
-      <w:r>
-        <w:rPr>
-          <w:rFonts w:eastAsia="Arial" w:cs="Arial"/>
-          <w:i/>
-          <w:iCs/>
-          <w:sz w:val="20"/>
-          <w:szCs w:val="20"/>
-          <w:color w:val="292D32"/>
-        </w:rPr>
-        <w:t xml:space="preserve"> </w:t>
-      </w:r>
-      <w:r>
-        <w:rPr>
-          <w:rFonts w:eastAsia="Arial" w:cs="Arial"/>
-          <w:i/>
-          <w:iCs/>
-          <w:sz w:val="20"/>
-          <w:szCs w:val="20"/>
-          <w:color w:val="292D32"/>
-        </w:rPr>
-        <w:t>Design and Application of Electrophilic Amine Salts for Modern Organic Synthesis</w:t>
+          <w:rFonts w:ascii="Arial" w:hAnsi="Arial"/>
+          <w:b w:val="0"/>
+          <w:sz w:val="20"/>
+        </w:rPr>
+        <w:t>Dissertation (defended): Electrophilic Amine Salts in Nitrogen-Group Transfer Reactions</w:t>
       </w:r>
     </w:p>
     <w:p>
@@ -475,9 +452,10 @@
       <w:r>
         <w:rPr>
           <w:rFonts w:ascii="Arial" w:hAnsi="Arial"/>
-          <w:sz w:val="20"/>
-        </w:rPr>
-        <w:t>Chemistry researcher specializing in small molecule synthesis, experimental design, reaction optimization, and mechanistic investigations. Develops reproducible laboratory protocols and investigates chemical reactivity using synthetic and analytical methods. Experienced in compound characterization, experimental troubleshooting, technical documentation, scientific publications, and research mentoring. Seeking to apply this experimental foundation to early formulation science and drug delivery.</w:t>
+          <w:b w:val="0"/>
+          <w:sz w:val="20"/>
+        </w:rPr>
+        <w:t>Chemistry researcher with a defended Ph.D. dissertation and experience in small molecule synthesis, experimental design, reaction optimization, and mechanistic investigations. Develops reproducible laboratory protocols and investigates chemical reactivity using synthetic and analytical methods. Experienced in compound characterization, experimental troubleshooting, scientific communication, and research mentoring. Seeking to apply this experimental foundation to early formulation science and drug delivery.</w:t>
       </w:r>
     </w:p>
     <w:p>
@@ -673,7 +651,7 @@
           <w:szCs w:val="20"/>
           <w:color w:val="292D32"/>
         </w:rPr>
-        <w:t>(PhD Candidate)</w:t>
+        <w:t>(Doctoral Researcher)</w:t>
       </w:r>
       <w:r>
         <w:rPr>
@@ -1135,9 +1113,10 @@
       <w:r>
         <w:rPr>
           <w:rFonts w:ascii="Arial" w:hAnsi="Arial"/>
-          <w:sz w:val="20"/>
-        </w:rPr>
-        <w:t>Designed and optimized C–N bond-forming reactions using electrochemistry, photochemistry, and transition-metal catalysis; applied mechanistic studies to guide method development and experimental troubleshooting.</w:t>
+          <w:b w:val="0"/>
+          <w:sz w:val="20"/>
+        </w:rPr>
+        <w:t>Elucidated oxidative and reductive pathways for photogeneration of arylamine radicals from N-pyridinium arylamine precursors, informing mechanistic understanding of nitrogen-group transfer chemistry (ACS Catal. 2024, 14, 13156–13162).</w:t>
       </w:r>
     </w:p>
     <w:p>
@@ -1340,9 +1319,10 @@
       <w:r>
         <w:rPr>
           <w:rFonts w:ascii="Arial" w:hAnsi="Arial"/>
-          <w:sz w:val="20"/>
-        </w:rPr>
-        <w:t>Designed the synthesis of osmium high-nuclearity carbonyl complexes and investigated their chemical reactivity for photoacoustic imaging (J. Clust. Sci. 2021, 32, 929–935).</w:t>
+          <w:b w:val="0"/>
+          <w:sz w:val="20"/>
+        </w:rPr>
+        <w:t>Investigated an osmium high-nuclearity carbonyl complex as a potential photoacoustic imaging contrast agent and studied its reactivity with gold electrophiles (J. Clust. Sci. 2021, 32, 929–935).</w:t>
       </w:r>
     </w:p>
     <w:p>
@@ -1935,133 +1915,11 @@
       </w:pPr>
       <w:r>
         <w:rPr>
-          <w:rFonts w:eastAsia="Arial" w:cs="Arial"/>
-          <w:b/>
-          <w:bCs/>
-          <w:sz w:val="20"/>
-          <w:szCs w:val="20"/>
-          <w:color w:val="292D32"/>
-        </w:rPr>
-        <w:t>Samanta, S.</w:t>
-      </w:r>
-      <w:r>
-        <w:rPr>
-          <w:rFonts w:eastAsia="Arial" w:cs="Arial"/>
-          <w:sz w:val="20"/>
-          <w:szCs w:val="20"/>
-          <w:color w:val="292D32"/>
-        </w:rPr>
-        <w:t xml:space="preserve">; </w:t>
-      </w:r>
-      <w:r>
-        <w:rPr>
-          <w:rFonts w:eastAsia="Arial" w:cs="Arial"/>
-          <w:sz w:val="20"/>
-          <w:szCs w:val="20"/>
-          <w:color w:val="292D32"/>
-        </w:rPr>
-        <w:t xml:space="preserve">Ojeda, M.; Nguyen, P.; Powers, D. C. Reductive Activation of </w:t>
-      </w:r>
-      <w:r>
-        <w:rPr>
-          <w:rFonts w:eastAsia="Arial" w:cs="Arial"/>
-          <w:i/>
-          <w:iCs/>
-          <w:sz w:val="20"/>
-          <w:szCs w:val="20"/>
-          <w:color w:val="292D32"/>
-        </w:rPr>
-        <w:t>N-</w:t>
-      </w:r>
-      <w:r>
-        <w:rPr>
-          <w:rFonts w:eastAsia="Arial" w:cs="Arial"/>
-          <w:sz w:val="20"/>
-          <w:szCs w:val="20"/>
-          <w:color w:val="292D32"/>
-        </w:rPr>
-        <w:t xml:space="preserve">Phenothiazinium Amine Salts Affords </w:t>
-      </w:r>
-      <w:r>
-        <w:rPr>
-          <w:rFonts w:eastAsia="Arial" w:cs="Arial"/>
-          <w:i/>
-          <w:iCs/>
-          <w:sz w:val="20"/>
-          <w:szCs w:val="20"/>
-          <w:color w:val="292D32"/>
-        </w:rPr>
-        <w:t>N</w:t>
-      </w:r>
-      <w:r>
-        <w:rPr>
-          <w:rFonts w:eastAsia="Arial" w:cs="Arial"/>
-          <w:sz w:val="20"/>
-          <w:szCs w:val="20"/>
-          <w:color w:val="292D32"/>
-        </w:rPr>
-        <w:t>-Centered Radicals,</w:t>
-      </w:r>
-      <w:r>
-        <w:rPr>
-          <w:rFonts w:eastAsia="Arial" w:cs="Arial"/>
-          <w:i/>
-          <w:iCs/>
-          <w:sz w:val="20"/>
-          <w:szCs w:val="20"/>
-          <w:color w:val="292D32"/>
-        </w:rPr>
-        <w:t xml:space="preserve"> </w:t>
-      </w:r>
-      <w:hyperlink r:id="rId11" w:history="1">
-        <w:r>
-          <w:rPr>
-            <w:rStyle w:val="Hyperlink"/>
-            <w:rFonts w:eastAsia="Arial" w:cs="Arial"/>
-            <w:i/>
-            <w:iCs/>
-            <w:sz w:val="20"/>
-            <w:szCs w:val="20"/>
-            <w:color w:val="292D32"/>
-          </w:rPr>
-          <w:t xml:space="preserve">Tetrahedron Lett. </w:t>
-        </w:r>
-        <w:r>
-          <w:rPr>
-            <w:rStyle w:val="Hyperlink"/>
-            <w:rFonts w:eastAsia="Arial" w:cs="Arial"/>
-            <w:bCs/>
-            <w:i/>
-            <w:iCs/>
-            <w:sz w:val="20"/>
-            <w:szCs w:val="20"/>
-            <w:color w:val="292D32"/>
-          </w:rPr>
-          <w:t>2026</w:t>
-        </w:r>
-        <w:r>
-          <w:rPr>
-            <w:rStyle w:val="Hyperlink"/>
-            <w:rFonts w:eastAsia="Arial" w:cs="Arial"/>
-            <w:i/>
-            <w:iCs/>
-            <w:sz w:val="20"/>
-            <w:szCs w:val="20"/>
-            <w:color w:val="292D32"/>
-          </w:rPr>
-          <w:t>, 183, 156204</w:t>
-        </w:r>
-      </w:hyperlink>
-      <w:r>
-        <w:rPr>
-          <w:rFonts w:eastAsia="Arial" w:cs="Arial"/>
-          <w:i/>
-          <w:iCs/>
-          <w:sz w:val="20"/>
-          <w:szCs w:val="20"/>
-          <w:color w:val="292D32"/>
-        </w:rPr>
-        <w:t>.</w:t>
+          <w:rFonts w:ascii="Arial" w:hAnsi="Arial"/>
+          <w:b w:val="0"/>
+          <w:sz w:val="20"/>
+        </w:rPr>
+        <w:t>Tan, H.; Samanta, S.; Qiu, N.; Adibekian, A.; Powers, D. C. Synthesis and Application of Bioactive N-Functionalized Aziridines. Angew. Chem. Int. Ed. 2025, 64, e202514630.</w:t>
       </w:r>
     </w:p>
     <w:p>

</xml_diff>

<commit_message>
Tailor AstraZeneca resume and restore scientific citation formatting
</commit_message>
<xml_diff>
--- a/resumes/Samya_Samanta_Pfizer_Early_Formulation.docx
+++ b/resumes/Samya_Samanta_Pfizer_Early_Formulation.docx
@@ -21,7 +21,7 @@
           <w:szCs w:val="36"/>
           <w:b/>
         </w:rPr>
-        <w:t>SAMYA SAMANTA</w:t>
+        <w:t xml:space="preserve">SAMYA SAMANTA</w:t>
       </w:r>
     </w:p>
     <w:p>
@@ -47,7 +47,7 @@
             <w:szCs w:val="16"/>
             <w:color w:val="292D32"/>
           </w:rPr>
-          <w:t>samya.samanta@tamu.edu</w:t>
+          <w:t xml:space="preserve">samya.samanta@tamu.edu</w:t>
         </w:r>
       </w:hyperlink>
       <w:r>
@@ -95,7 +95,6 @@
           <w:i w:val="0"/>
         </w:rPr>
         <w:lastRenderedPageBreak/>
-        <w:t xml:space="preserve">  </w:t>
       </w:r>
       <w:r>
         <w:rPr>
@@ -105,7 +104,17 @@
           <w:b/>
           <w:i w:val="0"/>
         </w:rPr>
-        <w:t>EDUCATION</w:t>
+        <w:t xml:space="preserve">  </w:t>
+      </w:r>
+      <w:r>
+        <w:rPr>
+          <w:rFonts w:eastAsia="Arial" w:cs="Arial"/>
+          <w:color w:val="253D50"/>
+          <w:sz w:val="21"/>
+          <w:b/>
+          <w:i w:val="0"/>
+        </w:rPr>
+        <w:t xml:space="preserve">EDUCATION</w:t>
       </w:r>
     </w:p>
     <w:p>
@@ -129,7 +138,7 @@
           <w:szCs w:val="20"/>
           <w:color w:val="292D32"/>
         </w:rPr>
-        <w:t>Ph.D. in Chemistry, Texas A&amp;M University, College Station, TX</w:t>
+        <w:t xml:space="preserve">Ph.D. in Chemistry, Texas A&amp;M University, College Station, TX</w:t>
       </w:r>
       <w:r>
         <w:rPr>
@@ -153,7 +162,7 @@
           <w:sz w:val="20"/>
           <w:szCs w:val="20"/>
         </w:rPr>
-        <w:t>2021</w:t>
+        <w:t xml:space="preserve">2021</w:t>
       </w:r>
       <w:r>
         <w:rPr>
@@ -179,7 +188,7 @@
           <w:sz w:val="20"/>
           <w:szCs w:val="20"/>
         </w:rPr>
-        <w:t>2026</w:t>
+        <w:t xml:space="preserve">2026</w:t>
       </w:r>
     </w:p>
     <w:p>
@@ -199,7 +208,7 @@
           <w:b w:val="0"/>
           <w:sz w:val="20"/>
         </w:rPr>
-        <w:t>Dissertation (defended): Electrophilic Amine Salts in Nitrogen-Group Transfer Reactions</w:t>
+        <w:t xml:space="preserve">Dissertation (defended): Electrophilic Amine Salts in Nitrogen-Group Transfer Reactions</w:t>
       </w:r>
     </w:p>
     <w:p>
@@ -222,7 +231,7 @@
           <w:szCs w:val="20"/>
           <w:color w:val="292D32"/>
         </w:rPr>
-        <w:t>Advisor:</w:t>
+        <w:t xml:space="preserve">Advisor:</w:t>
       </w:r>
       <w:r>
         <w:rPr>
@@ -241,7 +250,7 @@
           <w:szCs w:val="20"/>
           <w:color w:val="292D32"/>
         </w:rPr>
-        <w:t>David C. Powers</w:t>
+        <w:t xml:space="preserve">David C. Powers</w:t>
       </w:r>
       <w:r>
         <w:rPr>
@@ -268,7 +277,7 @@
           <w:szCs w:val="20"/>
           <w:color w:val="292D32"/>
         </w:rPr>
-        <w:t>GPA:</w:t>
+        <w:t xml:space="preserve">GPA:</w:t>
       </w:r>
       <w:r>
         <w:rPr>
@@ -311,7 +320,7 @@
           <w:szCs w:val="20"/>
           <w:color w:val="292D32"/>
         </w:rPr>
-        <w:t>BS &amp; MS in Chemistry, Indian Institute of Technology Kharagpur, India</w:t>
+        <w:t xml:space="preserve">BS &amp; MS in Chemistry, Indian Institute of Technology Kharagpur, India</w:t>
       </w:r>
       <w:r>
         <w:rPr>
@@ -336,7 +345,7 @@
           <w:sz w:val="20"/>
           <w:szCs w:val="20"/>
         </w:rPr>
-        <w:t>20</w:t>
+        <w:t xml:space="preserve">20</w:t>
       </w:r>
       <w:r>
         <w:rPr>
@@ -349,7 +358,7 @@
           <w:sz w:val="20"/>
           <w:szCs w:val="20"/>
         </w:rPr>
-        <w:t>15</w:t>
+        <w:t xml:space="preserve">15</w:t>
       </w:r>
       <w:r>
         <w:rPr>
@@ -375,7 +384,7 @@
           <w:sz w:val="20"/>
           <w:szCs w:val="20"/>
         </w:rPr>
-        <w:t>202</w:t>
+        <w:t xml:space="preserve">202</w:t>
       </w:r>
       <w:r>
         <w:rPr>
@@ -388,7 +397,7 @@
           <w:sz w:val="20"/>
           <w:szCs w:val="20"/>
         </w:rPr>
-        <w:t>0</w:t>
+        <w:t xml:space="preserve">0</w:t>
       </w:r>
     </w:p>
     <w:p>
@@ -455,7 +464,7 @@
           <w:b w:val="0"/>
           <w:sz w:val="20"/>
         </w:rPr>
-        <w:t>Chemistry researcher with a defended Ph.D. dissertation and experience in small molecule synthesis, experimental design, reaction optimization, and mechanistic investigations. Develops reproducible laboratory protocols and investigates chemical reactivity using synthetic and analytical methods. Experienced in compound characterization, experimental troubleshooting, scientific communication, and research mentoring. Seeking to apply this experimental foundation to early formulation science and drug delivery.</w:t>
+        <w:t xml:space="preserve">Chemistry researcher with a defended Ph.D. dissertation and experience in small molecule synthesis, experimental design, reaction optimization, and mechanistic investigations. Develops reproducible laboratory protocols and investigates chemical reactivity using synthetic and analytical methods. Experienced in compound characterization, experimental troubleshooting, scientific communication, and research mentoring. Seeking to apply this experimental foundation to early formulation science and drug delivery.</w:t>
       </w:r>
     </w:p>
     <w:p>
@@ -491,7 +500,7 @@
           <w:b/>
           <w:i w:val="0"/>
         </w:rPr>
-        <w:t>TECHNICAL SKILLS</w:t>
+        <w:t xml:space="preserve">TECHNICAL SKILLS</w:t>
       </w:r>
     </w:p>
     <w:p>
@@ -512,7 +521,7 @@
           <w:b/>
           <w:sz w:val="20"/>
         </w:rPr>
-        <w:t>Experimental Design &amp; Synthetic Chemistry:</w:t>
+        <w:t xml:space="preserve">Experimental Design &amp; Synthetic Chemistry:</w:t>
       </w:r>
       <w:r>
         <w:rPr>
@@ -541,7 +550,7 @@
           <w:b/>
           <w:sz w:val="20"/>
         </w:rPr>
-        <w:t>Analytical &amp; Characterization Techniques:</w:t>
+        <w:t xml:space="preserve">Analytical &amp; Characterization Techniques:</w:t>
       </w:r>
       <w:r>
         <w:rPr>
@@ -570,7 +579,7 @@
           <w:b/>
           <w:sz w:val="20"/>
         </w:rPr>
-        <w:t>Laboratory Research &amp; Communication:</w:t>
+        <w:t xml:space="preserve">Laboratory Research &amp; Communication:</w:t>
       </w:r>
       <w:r>
         <w:rPr>
@@ -628,7 +637,7 @@
           <w:szCs w:val="20"/>
           <w:color w:val="292D32"/>
         </w:rPr>
-        <w:t>Texas A&amp;M University, College Station, TX, USA</w:t>
+        <w:t xml:space="preserve">Texas A&amp;M University, College Station, TX, USA</w:t>
       </w:r>
       <w:r>
         <w:rPr>
@@ -651,7 +660,7 @@
           <w:szCs w:val="20"/>
           <w:color w:val="292D32"/>
         </w:rPr>
-        <w:t>(Doctoral Researcher)</w:t>
+        <w:t xml:space="preserve">(Doctoral Researcher)</w:t>
       </w:r>
       <w:r>
         <w:rPr>
@@ -677,7 +686,7 @@
           <w:sz w:val="20"/>
           <w:szCs w:val="20"/>
         </w:rPr>
-        <w:t>2021 – 2026</w:t>
+        <w:t xml:space="preserve">2021 – 2026</w:t>
       </w:r>
     </w:p>
     <w:p>
@@ -703,16 +712,16 @@
           <w:szCs w:val="20"/>
           <w:color w:val="292D32"/>
         </w:rPr>
-        <w:t>Developed three synthetic method</w:t>
-      </w:r>
-      <w:r>
-        <w:rPr>
-          <w:rFonts w:eastAsia="Arial" w:cs="Arial"/>
-          <w:sz w:val="20"/>
-          <w:szCs w:val="20"/>
-          <w:color w:val="292D32"/>
-        </w:rPr>
-        <w:t>ologies</w:t>
+        <w:t xml:space="preserve">Developed three synthetic method</w:t>
+      </w:r>
+      <w:r>
+        <w:rPr>
+          <w:rFonts w:eastAsia="Arial" w:cs="Arial"/>
+          <w:sz w:val="20"/>
+          <w:szCs w:val="20"/>
+          <w:color w:val="292D32"/>
+        </w:rPr>
+        <w:t xml:space="preserve">ologies</w:t>
       </w:r>
       <w:r>
         <w:rPr>
@@ -743,17 +752,17 @@
           <w:szCs w:val="20"/>
           <w:color w:val="292D32"/>
         </w:rPr>
-        <w:t>-Phenethylamine synthesis</w:t>
-      </w:r>
-      <w:r>
-        <w:rPr>
-          <w:rFonts w:eastAsia="Arial" w:cs="Arial"/>
-          <w:bCs/>
-          <w:sz w:val="20"/>
-          <w:szCs w:val="20"/>
-          <w:color w:val="292D32"/>
-        </w:rPr>
-        <w:t>,</w:t>
+        <w:t xml:space="preserve">-Phenethylamine synthesis</w:t>
+      </w:r>
+      <w:r>
+        <w:rPr>
+          <w:rFonts w:eastAsia="Arial" w:cs="Arial"/>
+          <w:bCs/>
+          <w:sz w:val="20"/>
+          <w:szCs w:val="20"/>
+          <w:color w:val="292D32"/>
+        </w:rPr>
+        <w:t xml:space="preserve">,</w:t>
       </w:r>
       <w:r>
         <w:rPr>
@@ -773,6 +782,18 @@
           <w:color w:val="292D32"/>
         </w:rPr>
         <w:t xml:space="preserve">a base-free C–N cross-electrophile coupling, resulting in publications in </w:t>
+      </w:r>
+      <w:r>
+        <w:rPr>
+          <w:rFonts w:eastAsia="Arial" w:cs="Arial"/>
+          <w:i w:val="1"/>
+          <w:iCs/>
+          <w:sz w:val="20"/>
+          <w:szCs w:val="20"/>
+          <w:color w:val="292D32"/>
+          <w:u w:val="none"/>
+        </w:rPr>
+        <w:t xml:space="preserve">JACS</w:t>
       </w:r>
       <w:r>
         <w:rPr>
@@ -783,7 +804,7 @@
           <w:szCs w:val="20"/>
           <w:color w:val="292D32"/>
         </w:rPr>
-        <w:t>JACS</w:t>
+        <w:t xml:space="preserve">,</w:t>
       </w:r>
       <w:r>
         <w:rPr>
@@ -794,7 +815,33 @@
           <w:szCs w:val="20"/>
           <w:color w:val="292D32"/>
         </w:rPr>
-        <w:t>,</w:t>
+        <w:t xml:space="preserve"> </w:t>
+      </w:r>
+      <w:proofErr w:type="spellStart"/>
+      <w:r>
+        <w:rPr>
+          <w:rFonts w:eastAsia="Arial" w:cs="Arial"/>
+          <w:i w:val="1"/>
+          <w:iCs/>
+          <w:sz w:val="20"/>
+          <w:szCs w:val="20"/>
+          <w:color w:val="292D32"/>
+          <w:u w:val="none"/>
+        </w:rPr>
+        <w:t xml:space="preserve">Angew</w:t>
+      </w:r>
+      <w:proofErr w:type="spellEnd"/>
+      <w:r>
+        <w:rPr>
+          <w:rFonts w:eastAsia="Arial" w:cs="Arial"/>
+          <w:i w:val="1"/>
+          <w:iCs/>
+          <w:sz w:val="20"/>
+          <w:szCs w:val="20"/>
+          <w:color w:val="292D32"/>
+          <w:u w:val="none"/>
+        </w:rPr>
+        <w:t xml:space="preserve">. Chem</w:t>
       </w:r>
       <w:r>
         <w:rPr>
@@ -807,7 +854,15 @@
         </w:rPr>
         <w:t xml:space="preserve"> </w:t>
       </w:r>
-      <w:proofErr w:type="spellStart"/>
+      <w:r>
+        <w:rPr>
+          <w:rFonts w:eastAsia="Arial" w:cs="Arial"/>
+          <w:sz w:val="20"/>
+          <w:szCs w:val="20"/>
+          <w:color w:val="292D32"/>
+        </w:rPr>
+        <w:t xml:space="preserve">and</w:t>
+      </w:r>
       <w:r>
         <w:rPr>
           <w:rFonts w:eastAsia="Arial" w:cs="Arial"/>
@@ -817,61 +872,31 @@
           <w:szCs w:val="20"/>
           <w:color w:val="292D32"/>
         </w:rPr>
-        <w:t>Angew</w:t>
-      </w:r>
-      <w:proofErr w:type="spellEnd"/>
-      <w:r>
-        <w:rPr>
-          <w:rFonts w:eastAsia="Arial" w:cs="Arial"/>
-          <w:i/>
+        <w:t xml:space="preserve"> </w:t>
+      </w:r>
+      <w:r>
+        <w:rPr>
+          <w:rFonts w:eastAsia="Arial" w:cs="Arial"/>
+          <w:i w:val="1"/>
           <w:iCs/>
           <w:sz w:val="20"/>
           <w:szCs w:val="20"/>
           <w:color w:val="292D32"/>
-        </w:rPr>
-        <w:t>. Chem</w:t>
-      </w:r>
-      <w:r>
-        <w:rPr>
-          <w:rFonts w:eastAsia="Arial" w:cs="Arial"/>
-          <w:i/>
+          <w:u w:val="none"/>
+        </w:rPr>
+        <w:t xml:space="preserve">Nat. Commun</w:t>
+      </w:r>
+      <w:r>
+        <w:rPr>
+          <w:rFonts w:eastAsia="Arial" w:cs="Arial"/>
+          <w:i w:val="1"/>
           <w:iCs/>
           <w:sz w:val="20"/>
           <w:szCs w:val="20"/>
           <w:color w:val="292D32"/>
-        </w:rPr>
-        <w:t xml:space="preserve"> </w:t>
-      </w:r>
-      <w:r>
-        <w:rPr>
-          <w:rFonts w:eastAsia="Arial" w:cs="Arial"/>
-          <w:sz w:val="20"/>
-          <w:szCs w:val="20"/>
-          <w:color w:val="292D32"/>
-        </w:rPr>
-        <w:t>and</w:t>
-      </w:r>
-      <w:r>
-        <w:rPr>
-          <w:rFonts w:eastAsia="Arial" w:cs="Arial"/>
-          <w:i/>
-          <w:iCs/>
-          <w:sz w:val="20"/>
-          <w:szCs w:val="20"/>
-          <w:color w:val="292D32"/>
-        </w:rPr>
-        <w:t xml:space="preserve"> Nat. Commun</w:t>
-      </w:r>
-      <w:r>
-        <w:rPr>
-          <w:rFonts w:eastAsia="Arial" w:cs="Arial"/>
-          <w:i/>
-          <w:iCs/>
-          <w:sz w:val="20"/>
-          <w:szCs w:val="20"/>
-          <w:color w:val="292D32"/>
-        </w:rPr>
-        <w:t>.</w:t>
+          <w:u w:val="none"/>
+        </w:rPr>
+        <w:t xml:space="preserve">.</w:t>
       </w:r>
       <w:r>
         <w:rPr>
@@ -904,7 +929,38 @@
           <w:rFonts w:ascii="Arial" w:hAnsi="Arial"/>
           <w:sz w:val="20"/>
         </w:rPr>
-        <w:t>Developed a robust, scalable, and reproducible laboratory protocol for N-pyridinium aziridines, a bench-stable aziridine synthon; documented the procedure in Organic Syntheses.</w:t>
+        <w:t xml:space="preserve">Developed a robust, scalable, and reproducible laboratory protocol for </w:t>
+      </w:r>
+      <w:r>
+        <w:rPr>
+          <w:rFonts w:ascii="Arial" w:hAnsi="Arial"/>
+          <w:sz w:val="20"/>
+          <w:i w:val="1"/>
+        </w:rPr>
+        <w:t xml:space="preserve">N</w:t>
+      </w:r>
+      <w:r>
+        <w:rPr>
+          <w:rFonts w:ascii="Arial" w:hAnsi="Arial"/>
+          <w:sz w:val="20"/>
+        </w:rPr>
+        <w:t xml:space="preserve">-pyridinium aziridines, a bench-stable aziridine synthon; documented the procedure in </w:t>
+      </w:r>
+      <w:r>
+        <w:rPr>
+          <w:rFonts w:ascii="Arial" w:hAnsi="Arial"/>
+          <w:sz w:val="20"/>
+          <w:i w:val="1"/>
+          <w:u w:val="none"/>
+        </w:rPr>
+        <w:t xml:space="preserve">Organic Syntheses</w:t>
+      </w:r>
+      <w:r>
+        <w:rPr>
+          <w:rFonts w:ascii="Arial" w:hAnsi="Arial"/>
+          <w:sz w:val="20"/>
+        </w:rPr>
+        <w:t xml:space="preserve">.</w:t>
       </w:r>
     </w:p>
     <w:p>
@@ -930,7 +986,7 @@
           <w:szCs w:val="20"/>
           <w:color w:val="292D32"/>
         </w:rPr>
-        <w:t>Developed</w:t>
+        <w:t xml:space="preserve">Developed</w:t>
       </w:r>
       <w:r>
         <w:rPr>
@@ -958,7 +1014,7 @@
           <w:szCs w:val="20"/>
           <w:color w:val="292D32"/>
         </w:rPr>
-        <w:t>aminyl</w:t>
+        <w:t xml:space="preserve">aminyl</w:t>
       </w:r>
       <w:proofErr w:type="spellEnd"/>
       <w:r>
@@ -986,7 +1042,7 @@
           <w:szCs w:val="20"/>
           <w:color w:val="292D32"/>
         </w:rPr>
-        <w:t>based on</w:t>
+        <w:t xml:space="preserve">based on</w:t>
       </w:r>
       <w:r>
         <w:rPr>
@@ -1006,25 +1062,18 @@
           <w:szCs w:val="20"/>
           <w:color w:val="292D32"/>
         </w:rPr>
-        <w:t xml:space="preserve"> N-</w:t>
-      </w:r>
-      <w:r>
-        <w:rPr>
-          <w:rFonts w:eastAsia="Arial" w:cs="Arial"/>
-          <w:sz w:val="20"/>
-          <w:szCs w:val="20"/>
-          <w:color w:val="292D32"/>
-        </w:rPr>
-        <w:t xml:space="preserve">pyridinium </w:t>
-      </w:r>
-      <w:r>
-        <w:rPr>
-          <w:rFonts w:eastAsia="Arial" w:cs="Arial"/>
-          <w:sz w:val="20"/>
-          <w:szCs w:val="20"/>
-          <w:color w:val="292D32"/>
-        </w:rPr>
-        <w:t xml:space="preserve">and </w:t>
+        <w:t xml:space="preserve"> </w:t>
+      </w:r>
+      <w:r>
+        <w:rPr>
+          <w:rFonts w:eastAsia="Arial" w:cs="Arial"/>
+          <w:i w:val="1"/>
+          <w:iCs/>
+          <w:sz w:val="20"/>
+          <w:szCs w:val="20"/>
+          <w:color w:val="292D32"/>
+        </w:rPr>
+        <w:t xml:space="preserve">N</w:t>
       </w:r>
       <w:r>
         <w:rPr>
@@ -1035,7 +1084,36 @@
           <w:szCs w:val="20"/>
           <w:color w:val="292D32"/>
         </w:rPr>
-        <w:t>N</w:t>
+        <w:t xml:space="preserve">-</w:t>
+      </w:r>
+      <w:r>
+        <w:rPr>
+          <w:rFonts w:eastAsia="Arial" w:cs="Arial"/>
+          <w:sz w:val="20"/>
+          <w:szCs w:val="20"/>
+          <w:color w:val="292D32"/>
+        </w:rPr>
+        <w:t xml:space="preserve">pyridinium </w:t>
+      </w:r>
+      <w:r>
+        <w:rPr>
+          <w:rFonts w:eastAsia="Arial" w:cs="Arial"/>
+          <w:sz w:val="20"/>
+          <w:szCs w:val="20"/>
+          <w:color w:val="292D32"/>
+        </w:rPr>
+        <w:t xml:space="preserve">and </w:t>
+      </w:r>
+      <w:r>
+        <w:rPr>
+          <w:rFonts w:eastAsia="Arial" w:cs="Arial"/>
+          <w:i w:val="1"/>
+          <w:iCs/>
+          <w:sz w:val="20"/>
+          <w:szCs w:val="20"/>
+          <w:color w:val="292D32"/>
+        </w:rPr>
+        <w:t xml:space="preserve">N</w:t>
       </w:r>
       <w:r>
         <w:rPr>
@@ -1058,13 +1136,13 @@
       <w:r>
         <w:rPr>
           <w:rFonts w:eastAsia="Arial" w:cs="Arial"/>
-          <w:i/>
+          <w:i w:val="1"/>
           <w:iCs/>
           <w:sz w:val="20"/>
           <w:szCs w:val="20"/>
           <w:color w:val="292D32"/>
         </w:rPr>
-        <w:t>N</w:t>
+        <w:t xml:space="preserve">N</w:t>
       </w:r>
       <w:r>
         <w:rPr>
@@ -1082,16 +1160,16 @@
           <w:szCs w:val="20"/>
           <w:color w:val="292D32"/>
         </w:rPr>
-        <w:t>generation</w:t>
-      </w:r>
-      <w:r>
-        <w:rPr>
-          <w:rFonts w:eastAsia="Arial" w:cs="Arial"/>
-          <w:sz w:val="20"/>
-          <w:szCs w:val="20"/>
-          <w:color w:val="292D32"/>
-        </w:rPr>
-        <w:t>.</w:t>
+        <w:t xml:space="preserve">generation</w:t>
+      </w:r>
+      <w:r>
+        <w:rPr>
+          <w:rFonts w:eastAsia="Arial" w:cs="Arial"/>
+          <w:sz w:val="20"/>
+          <w:szCs w:val="20"/>
+          <w:color w:val="292D32"/>
+        </w:rPr>
+        <w:t xml:space="preserve">.</w:t>
       </w:r>
     </w:p>
     <w:p>
@@ -1116,7 +1194,42 @@
           <w:b w:val="0"/>
           <w:sz w:val="20"/>
         </w:rPr>
-        <w:t>Elucidated oxidative and reductive pathways for photogeneration of arylamine radicals from N-pyridinium arylamine precursors, informing mechanistic understanding of nitrogen-group transfer chemistry (ACS Catal. 2024, 14, 13156–13162).</w:t>
+        <w:t xml:space="preserve">Elucidated oxidative and reductive pathways for photogeneration of arylamine radicals from </w:t>
+      </w:r>
+      <w:r>
+        <w:rPr>
+          <w:rFonts w:ascii="Arial" w:hAnsi="Arial"/>
+          <w:b w:val="0"/>
+          <w:sz w:val="20"/>
+          <w:i w:val="1"/>
+        </w:rPr>
+        <w:t xml:space="preserve">N</w:t>
+      </w:r>
+      <w:r>
+        <w:rPr>
+          <w:rFonts w:ascii="Arial" w:hAnsi="Arial"/>
+          <w:b w:val="0"/>
+          <w:sz w:val="20"/>
+        </w:rPr>
+        <w:t xml:space="preserve">-pyridinium arylamine precursors, informing mechanistic understanding of nitrogen-group transfer chemistry (</w:t>
+      </w:r>
+      <w:r>
+        <w:rPr>
+          <w:rFonts w:ascii="Arial" w:hAnsi="Arial"/>
+          <w:b w:val="0"/>
+          <w:sz w:val="20"/>
+          <w:i w:val="1"/>
+          <w:u w:val="none"/>
+        </w:rPr>
+        <w:t xml:space="preserve">ACS Catal.</w:t>
+      </w:r>
+      <w:r>
+        <w:rPr>
+          <w:rFonts w:ascii="Arial" w:hAnsi="Arial"/>
+          <w:b w:val="0"/>
+          <w:sz w:val="20"/>
+        </w:rPr>
+        <w:t xml:space="preserve"> 2024, 14, 13156–13162).</w:t>
       </w:r>
     </w:p>
     <w:p>
@@ -1142,7 +1255,7 @@
           <w:szCs w:val="20"/>
           <w:color w:val="292D32"/>
         </w:rPr>
-        <w:t>Mentored six undergraduate and graduate researchers in synthetic organic chemistry, analytical characterization, air-sensitive techniques, and laboratory safety, enabling independent research.</w:t>
+        <w:t xml:space="preserve">Mentored six undergraduate and graduate researchers in synthetic organic chemistry, analytical characterization, air-sensitive techniques, and laboratory safety, enabling independent research.</w:t>
       </w:r>
     </w:p>
     <w:p>
@@ -1178,7 +1291,7 @@
           <w:szCs w:val="20"/>
           <w:color w:val="292D32"/>
         </w:rPr>
-        <w:t>(MS Researcher</w:t>
+        <w:t xml:space="preserve">(MS Researcher</w:t>
       </w:r>
       <w:r>
         <w:rPr>
@@ -1190,7 +1303,7 @@
           <w:szCs w:val="20"/>
           <w:color w:val="292D32"/>
         </w:rPr>
-        <w:t>)</w:t>
+        <w:t xml:space="preserve">)</w:t>
       </w:r>
       <w:r>
         <w:rPr>
@@ -1214,7 +1327,7 @@
           <w:sz w:val="20"/>
           <w:szCs w:val="20"/>
         </w:rPr>
-        <w:t>2019 – 2020</w:t>
+        <w:t xml:space="preserve">2019 – 2020</w:t>
       </w:r>
     </w:p>
     <w:p>
@@ -1238,7 +1351,23 @@
           <w:rFonts w:ascii="Arial" w:hAnsi="Arial"/>
           <w:sz w:val="20"/>
         </w:rPr>
-        <w:t>Evaluated reaction conditions and substrate scope to develop organophotoredox-mediated amide and benzothiazole synthesis (Chem. Eur. J. 2020, 26, 3703–3708).</w:t>
+        <w:t xml:space="preserve">Evaluated reaction conditions and substrate scope to develop organophotoredox-mediated amide and benzothiazole synthesis (</w:t>
+      </w:r>
+      <w:r>
+        <w:rPr>
+          <w:rFonts w:ascii="Arial" w:hAnsi="Arial"/>
+          <w:sz w:val="20"/>
+          <w:i w:val="1"/>
+          <w:u w:val="none"/>
+        </w:rPr>
+        <w:t xml:space="preserve">Chem. Eur. J.</w:t>
+      </w:r>
+      <w:r>
+        <w:rPr>
+          <w:rFonts w:ascii="Arial" w:hAnsi="Arial"/>
+          <w:sz w:val="20"/>
+        </w:rPr>
+        <w:t xml:space="preserve"> 2020, 26, 3703–3708).</w:t>
       </w:r>
     </w:p>
     <w:p>
@@ -1274,7 +1403,7 @@
           <w:szCs w:val="20"/>
           <w:color w:val="292D32"/>
         </w:rPr>
-        <w:t>(Research Intern)</w:t>
+        <w:t xml:space="preserve">(Research Intern)</w:t>
       </w:r>
       <w:r>
         <w:rPr>
@@ -1297,7 +1426,7 @@
           <w:sz w:val="20"/>
           <w:szCs w:val="20"/>
         </w:rPr>
-        <w:t>May 2019 – July 2019</w:t>
+        <w:t xml:space="preserve">May 2019 – July 2019</w:t>
       </w:r>
     </w:p>
     <w:p>
@@ -1322,7 +1451,25 @@
           <w:b w:val="0"/>
           <w:sz w:val="20"/>
         </w:rPr>
-        <w:t>Investigated an osmium high-nuclearity carbonyl complex as a potential photoacoustic imaging contrast agent and studied its reactivity with gold electrophiles (J. Clust. Sci. 2021, 32, 929–935).</w:t>
+        <w:t xml:space="preserve">Investigated an osmium high-nuclearity carbonyl complex as a potential photoacoustic imaging contrast agent and studied its reactivity with gold electrophiles (</w:t>
+      </w:r>
+      <w:r>
+        <w:rPr>
+          <w:rFonts w:ascii="Arial" w:hAnsi="Arial"/>
+          <w:b w:val="0"/>
+          <w:sz w:val="20"/>
+          <w:i w:val="1"/>
+          <w:u w:val="none"/>
+        </w:rPr>
+        <w:t xml:space="preserve">J. Clust. Sci.</w:t>
+      </w:r>
+      <w:r>
+        <w:rPr>
+          <w:rFonts w:ascii="Arial" w:hAnsi="Arial"/>
+          <w:b w:val="0"/>
+          <w:sz w:val="20"/>
+        </w:rPr>
+        <w:t xml:space="preserve"> 2021, 32, 929–935).</w:t>
       </w:r>
     </w:p>
     <w:p>
@@ -1358,7 +1505,7 @@
           <w:szCs w:val="20"/>
           <w:color w:val="292D32"/>
         </w:rPr>
-        <w:t>(Research Intern)</w:t>
+        <w:t xml:space="preserve">(Research Intern)</w:t>
       </w:r>
       <w:r>
         <w:rPr>
@@ -1383,7 +1530,7 @@
           <w:sz w:val="20"/>
           <w:szCs w:val="20"/>
         </w:rPr>
-        <w:t>May 2018 – July 2018</w:t>
+        <w:t xml:space="preserve">May 2018 – July 2018</w:t>
       </w:r>
     </w:p>
     <w:p>
@@ -1409,7 +1556,19 @@
           <w:szCs w:val="20"/>
           <w:color w:val="292D32"/>
         </w:rPr>
-        <w:t>Developed synthetic routes to carbazole-bis(tetrazole) ligands and evaluated the corresponding platinum and palladium complexes as sustainable oxidation catalysts (</w:t>
+        <w:t xml:space="preserve">Developed synthetic routes to carbazole-bis(tetrazole) ligands and evaluated the corresponding platinum and palladium complexes as sustainable oxidation catalysts (</w:t>
+      </w:r>
+      <w:r>
+        <w:rPr>
+          <w:rFonts w:eastAsia="Arial" w:cs="Arial"/>
+          <w:i w:val="1"/>
+          <w:iCs/>
+          <w:sz w:val="20"/>
+          <w:szCs w:val="20"/>
+          <w:color w:val="292D32"/>
+          <w:u w:val="none"/>
+        </w:rPr>
+        <w:t xml:space="preserve">J. Coord. Chem.</w:t>
       </w:r>
       <w:r>
         <w:rPr>
@@ -1420,7 +1579,7 @@
           <w:szCs w:val="20"/>
           <w:color w:val="292D32"/>
         </w:rPr>
-        <w:t xml:space="preserve">J. Coord. Chem. </w:t>
+        <w:t xml:space="preserve"> </w:t>
       </w:r>
       <w:r>
         <w:rPr>
@@ -1441,7 +1600,7 @@
           <w:szCs w:val="20"/>
           <w:color w:val="292D32"/>
         </w:rPr>
-        <w:t>74,</w:t>
+        <w:t xml:space="preserve">74,</w:t>
       </w:r>
       <w:r>
         <w:rPr>
@@ -1486,7 +1645,7 @@
           <w:szCs w:val="20"/>
           <w:color w:val="292D32"/>
         </w:rPr>
-        <w:t>(</w:t>
+        <w:t xml:space="preserve">(</w:t>
       </w:r>
       <w:r>
         <w:rPr>
@@ -1499,7 +1658,7 @@
           <w:szCs w:val="20"/>
           <w:color w:val="292D32"/>
         </w:rPr>
-        <w:t>Research Intern</w:t>
+        <w:t xml:space="preserve">Research Intern</w:t>
       </w:r>
       <w:r>
         <w:rPr>
@@ -1512,7 +1671,7 @@
           <w:szCs w:val="20"/>
           <w:color w:val="292D32"/>
         </w:rPr>
-        <w:t>).</w:t>
+        <w:t xml:space="preserve">).</w:t>
       </w:r>
       <w:r>
         <w:rPr>
@@ -1537,7 +1696,7 @@
           <w:sz w:val="20"/>
           <w:szCs w:val="20"/>
         </w:rPr>
-        <w:t>May 2017– July 2017</w:t>
+        <w:t xml:space="preserve">May 2017– July 2017</w:t>
       </w:r>
     </w:p>
     <w:p>
@@ -1561,7 +1720,7 @@
           <w:rFonts w:ascii="Arial" w:hAnsi="Arial"/>
           <w:sz w:val="20"/>
         </w:rPr>
-        <w:t>Synthesized a hexatopic triptycene hexa-acid linker and investigated metal-assisted self-assembly into honeycomb-structured metal–organic frameworks (MOFs).</w:t>
+        <w:t xml:space="preserve">Synthesized a hexatopic triptycene hexa-acid linker and investigated metal-assisted self-assembly into honeycomb-structured metal–organic frameworks (MOFs).</w:t>
       </w:r>
     </w:p>
     <w:p>
@@ -1607,7 +1766,7 @@
           <w:b/>
           <w:i w:val="0"/>
         </w:rPr>
-        <w:t>PUBLICATIONS</w:t>
+        <w:t xml:space="preserve">PUBLICATIONS</w:t>
       </w:r>
       <w:r>
         <w:rPr>
@@ -1644,16 +1803,16 @@
           <w:szCs w:val="20"/>
           <w:color w:val="292D32"/>
         </w:rPr>
-        <w:t>Samanta, S.</w:t>
-      </w:r>
-      <w:r>
-        <w:rPr>
-          <w:rFonts w:eastAsia="Arial" w:cs="Arial"/>
-          <w:sz w:val="20"/>
-          <w:szCs w:val="20"/>
-          <w:color w:val="292D32"/>
-        </w:rPr>
-        <w:t>; Patel, L.; Manna, D.;</w:t>
+        <w:t xml:space="preserve">Samanta, S.</w:t>
+      </w:r>
+      <w:r>
+        <w:rPr>
+          <w:rFonts w:eastAsia="Arial" w:cs="Arial"/>
+          <w:sz w:val="20"/>
+          <w:szCs w:val="20"/>
+          <w:color w:val="292D32"/>
+        </w:rPr>
+        <w:t xml:space="preserve">; Patel, L.; Manna, D.;</w:t>
       </w:r>
       <w:r>
         <w:rPr>
@@ -1679,13 +1838,14 @@
           <w:rPr>
             <w:rStyle w:val="Hyperlink"/>
             <w:rFonts w:eastAsia="Arial" w:cs="Arial"/>
-            <w:i/>
+            <w:i w:val="1"/>
             <w:iCs/>
             <w:sz w:val="20"/>
             <w:szCs w:val="20"/>
             <w:color w:val="292D32"/>
+            <w:u w:val="none"/>
           </w:rPr>
-          <w:t>J. Am. Chem. Soc.</w:t>
+          <w:t xml:space="preserve">J. Am. Chem. Soc.</w:t>
         </w:r>
         <w:r>
           <w:rPr>
@@ -1705,8 +1865,11 @@
             <w:sz w:val="20"/>
             <w:szCs w:val="20"/>
             <w:color w:val="292D32"/>
+            <w:b w:val="1"/>
+            <w:i w:val="0"/>
+            <w:u w:val="none"/>
           </w:rPr>
-          <w:t>2026</w:t>
+          <w:t xml:space="preserve">2026</w:t>
         </w:r>
         <w:r>
           <w:rPr>
@@ -1716,7 +1879,7 @@
             <w:szCs w:val="20"/>
             <w:color w:val="292D32"/>
           </w:rPr>
-          <w:t>,</w:t>
+          <w:t xml:space="preserve">,</w:t>
         </w:r>
         <w:r>
           <w:rPr>
@@ -1728,7 +1891,33 @@
             <w:szCs w:val="20"/>
             <w:color w:val="292D32"/>
           </w:rPr>
-          <w:t xml:space="preserve"> 148, </w:t>
+          <w:t xml:space="preserve"> </w:t>
+        </w:r>
+        <w:r>
+          <w:rPr>
+            <w:rStyle w:val="Hyperlink"/>
+            <w:rFonts w:eastAsia="Arial" w:cs="Arial"/>
+            <w:i w:val="1"/>
+            <w:iCs/>
+            <w:sz w:val="20"/>
+            <w:szCs w:val="20"/>
+            <w:color w:val="292D32"/>
+            <w:b w:val="0"/>
+            <w:u w:val="none"/>
+          </w:rPr>
+          <w:t xml:space="preserve">148</w:t>
+        </w:r>
+        <w:r>
+          <w:rPr>
+            <w:rStyle w:val="Hyperlink"/>
+            <w:rFonts w:eastAsia="Arial" w:cs="Arial"/>
+            <w:i/>
+            <w:iCs/>
+            <w:sz w:val="20"/>
+            <w:szCs w:val="20"/>
+            <w:color w:val="292D32"/>
+          </w:rPr>
+          <w:t xml:space="preserve">, </w:t>
         </w:r>
         <w:r>
           <w:rPr>
@@ -1738,7 +1927,7 @@
             <w:szCs w:val="20"/>
             <w:color w:val="292D32"/>
           </w:rPr>
-          <w:t>33104–33117</w:t>
+          <w:t xml:space="preserve">33104–33117</w:t>
         </w:r>
       </w:hyperlink>
       <w:r>
@@ -1750,7 +1939,7 @@
           <w:szCs w:val="20"/>
           <w:color w:val="292D32"/>
         </w:rPr>
-        <w:t>.</w:t>
+        <w:t xml:space="preserve">.</w:t>
       </w:r>
     </w:p>
     <w:p>
@@ -1777,16 +1966,16 @@
           <w:szCs w:val="20"/>
           <w:color w:val="292D32"/>
         </w:rPr>
-        <w:t>Samanta, S.</w:t>
-      </w:r>
-      <w:r>
-        <w:rPr>
-          <w:rFonts w:eastAsia="Arial" w:cs="Arial"/>
-          <w:sz w:val="20"/>
-          <w:szCs w:val="20"/>
-          <w:color w:val="292D32"/>
-        </w:rPr>
-        <w:t>; Tan, H.; Chatterjee, S.;</w:t>
+        <w:t xml:space="preserve">Samanta, S.</w:t>
+      </w:r>
+      <w:r>
+        <w:rPr>
+          <w:rFonts w:eastAsia="Arial" w:cs="Arial"/>
+          <w:sz w:val="20"/>
+          <w:szCs w:val="20"/>
+          <w:color w:val="292D32"/>
+        </w:rPr>
+        <w:t xml:space="preserve">; Tan, H.; Chatterjee, S.;</w:t>
       </w:r>
       <w:r>
         <w:rPr>
@@ -1810,22 +1999,22 @@
       <w:r>
         <w:rPr>
           <w:rFonts w:eastAsia="Arial" w:cs="Arial"/>
-          <w:i/>
+          <w:i w:val="1"/>
           <w:iCs/>
           <w:sz w:val="20"/>
           <w:szCs w:val="20"/>
           <w:color w:val="292D32"/>
         </w:rPr>
-        <w:t>N</w:t>
-      </w:r>
-      <w:r>
-        <w:rPr>
-          <w:rFonts w:eastAsia="Arial" w:cs="Arial"/>
-          <w:sz w:val="20"/>
-          <w:szCs w:val="20"/>
-          <w:color w:val="292D32"/>
-        </w:rPr>
-        <w:t>-Pyridinium Aziridines</w:t>
+        <w:t xml:space="preserve">N</w:t>
+      </w:r>
+      <w:r>
+        <w:rPr>
+          <w:rFonts w:eastAsia="Arial" w:cs="Arial"/>
+          <w:sz w:val="20"/>
+          <w:szCs w:val="20"/>
+          <w:color w:val="292D32"/>
+        </w:rPr>
+        <w:t xml:space="preserve">-Pyridinium Aziridines</w:t>
       </w:r>
       <w:r>
         <w:rPr>
@@ -1843,24 +2032,14 @@
           <w:rPr>
             <w:rStyle w:val="Hyperlink"/>
             <w:rFonts w:eastAsia="Arial" w:cs="Arial"/>
-            <w:i/>
+            <w:i w:val="1"/>
             <w:iCs/>
             <w:sz w:val="20"/>
             <w:szCs w:val="20"/>
             <w:color w:val="292D32"/>
+            <w:u w:val="none"/>
           </w:rPr>
-          <w:t xml:space="preserve">Org. Synth. </w:t>
-        </w:r>
-        <w:r>
-          <w:rPr>
-            <w:rStyle w:val="Hyperlink"/>
-            <w:rFonts w:eastAsia="Arial" w:cs="Arial"/>
-            <w:bCs/>
-            <w:sz w:val="20"/>
-            <w:szCs w:val="20"/>
-            <w:color w:val="292D32"/>
-          </w:rPr>
-          <w:t>2026</w:t>
+          <w:t xml:space="preserve">Org. Synth.</w:t>
         </w:r>
         <w:r>
           <w:rPr>
@@ -1872,17 +2051,21 @@
             <w:szCs w:val="20"/>
             <w:color w:val="292D32"/>
           </w:rPr>
-          <w:t xml:space="preserve">, 103, </w:t>
+          <w:t xml:space="preserve"> </w:t>
         </w:r>
         <w:r>
           <w:rPr>
             <w:rStyle w:val="Hyperlink"/>
             <w:rFonts w:eastAsia="Arial" w:cs="Arial"/>
+            <w:bCs/>
             <w:sz w:val="20"/>
             <w:szCs w:val="20"/>
             <w:color w:val="292D32"/>
+            <w:b w:val="1"/>
+            <w:i w:val="0"/>
+            <w:u w:val="none"/>
           </w:rPr>
-          <w:t>78–100</w:t>
+          <w:t xml:space="preserve">2026</w:t>
         </w:r>
         <w:r>
           <w:rPr>
@@ -1894,7 +2077,55 @@
             <w:szCs w:val="20"/>
             <w:color w:val="292D32"/>
           </w:rPr>
-          <w:t>.</w:t>
+          <w:t xml:space="preserve">, </w:t>
+        </w:r>
+        <w:r>
+          <w:rPr>
+            <w:rStyle w:val="Hyperlink"/>
+            <w:rFonts w:eastAsia="Arial" w:cs="Arial"/>
+            <w:i w:val="1"/>
+            <w:iCs/>
+            <w:sz w:val="20"/>
+            <w:szCs w:val="20"/>
+            <w:color w:val="292D32"/>
+            <w:b w:val="0"/>
+            <w:u w:val="none"/>
+          </w:rPr>
+          <w:t xml:space="preserve">103</w:t>
+        </w:r>
+        <w:r>
+          <w:rPr>
+            <w:rStyle w:val="Hyperlink"/>
+            <w:rFonts w:eastAsia="Arial" w:cs="Arial"/>
+            <w:i/>
+            <w:iCs/>
+            <w:sz w:val="20"/>
+            <w:szCs w:val="20"/>
+            <w:color w:val="292D32"/>
+          </w:rPr>
+          <w:t xml:space="preserve">, </w:t>
+        </w:r>
+        <w:r>
+          <w:rPr>
+            <w:rStyle w:val="Hyperlink"/>
+            <w:rFonts w:eastAsia="Arial" w:cs="Arial"/>
+            <w:sz w:val="20"/>
+            <w:szCs w:val="20"/>
+            <w:color w:val="292D32"/>
+          </w:rPr>
+          <w:t xml:space="preserve">78–100</w:t>
+        </w:r>
+        <w:r>
+          <w:rPr>
+            <w:rStyle w:val="Hyperlink"/>
+            <w:rFonts w:eastAsia="Arial" w:cs="Arial"/>
+            <w:i/>
+            <w:iCs/>
+            <w:sz w:val="20"/>
+            <w:szCs w:val="20"/>
+            <w:color w:val="292D32"/>
+          </w:rPr>
+          <w:t xml:space="preserve">.</w:t>
         </w:r>
       </w:hyperlink>
     </w:p>
@@ -1919,7 +2150,78 @@
           <w:b w:val="0"/>
           <w:sz w:val="20"/>
         </w:rPr>
-        <w:t>Tan, H.; Samanta, S.; Qiu, N.; Adibekian, A.; Powers, D. C. Synthesis and Application of Bioactive N-Functionalized Aziridines. Angew. Chem. Int. Ed. 2025, 64, e202514630.</w:t>
+        <w:t xml:space="preserve">Tan, H.; Samanta, S.; Qiu, N.; Adibekian, A.; Powers, D. C. Synthesis and Application of Bioactive </w:t>
+      </w:r>
+      <w:r>
+        <w:rPr>
+          <w:rFonts w:ascii="Arial" w:hAnsi="Arial"/>
+          <w:b w:val="0"/>
+          <w:sz w:val="20"/>
+          <w:i w:val="1"/>
+        </w:rPr>
+        <w:t xml:space="preserve">N</w:t>
+      </w:r>
+      <w:r>
+        <w:rPr>
+          <w:rFonts w:ascii="Arial" w:hAnsi="Arial"/>
+          <w:b w:val="0"/>
+          <w:sz w:val="20"/>
+        </w:rPr>
+        <w:t xml:space="preserve">-Functionalized Aziridines. </w:t>
+      </w:r>
+      <w:r>
+        <w:rPr>
+          <w:rFonts w:ascii="Arial" w:hAnsi="Arial"/>
+          <w:b w:val="0"/>
+          <w:sz w:val="20"/>
+          <w:i w:val="1"/>
+          <w:u w:val="none"/>
+        </w:rPr>
+        <w:t xml:space="preserve">Angew. Chem. Int. Ed.</w:t>
+      </w:r>
+      <w:r>
+        <w:rPr>
+          <w:rFonts w:ascii="Arial" w:hAnsi="Arial"/>
+          <w:b w:val="0"/>
+          <w:sz w:val="20"/>
+        </w:rPr>
+        <w:t xml:space="preserve"> </w:t>
+      </w:r>
+      <w:r>
+        <w:rPr>
+          <w:rFonts w:ascii="Arial" w:hAnsi="Arial"/>
+          <w:b w:val="1"/>
+          <w:sz w:val="20"/>
+          <w:i w:val="0"/>
+          <w:u w:val="none"/>
+        </w:rPr>
+        <w:t xml:space="preserve">2025</w:t>
+      </w:r>
+      <w:r>
+        <w:rPr>
+          <w:rFonts w:ascii="Arial" w:hAnsi="Arial"/>
+          <w:b w:val="0"/>
+          <w:sz w:val="20"/>
+        </w:rPr>
+        <w:t xml:space="preserve">, </w:t>
+      </w:r>
+      <w:r>
+        <w:rPr>
+          <w:rFonts w:ascii="Arial" w:hAnsi="Arial"/>
+          <w:b w:val="0"/>
+          <w:sz w:val="20"/>
+          <w:i w:val="1"/>
+          <w:u w:val="none"/>
+        </w:rPr>
+        <w:t xml:space="preserve">64</w:t>
+      </w:r>
+      <w:r>
+        <w:rPr>
+          <w:rFonts w:ascii="Arial" w:hAnsi="Arial"/>
+          <w:b w:val="0"/>
+          <w:sz w:val="20"/>
+        </w:rPr>
+        <w:t xml:space="preserve">, e202514630.</w:t>
       </w:r>
     </w:p>
     <w:p>
@@ -1946,16 +2248,16 @@
           <w:szCs w:val="20"/>
           <w:color w:val="292D32"/>
         </w:rPr>
-        <w:t>Samanta, S.</w:t>
-      </w:r>
-      <w:r>
-        <w:rPr>
-          <w:rFonts w:eastAsia="Arial" w:cs="Arial"/>
-          <w:sz w:val="20"/>
-          <w:szCs w:val="20"/>
-          <w:color w:val="292D32"/>
-        </w:rPr>
-        <w:t>; Biswas, P.; O’Bannon, B.; Powers, D. C.</w:t>
+        <w:t xml:space="preserve">Samanta, S.</w:t>
+      </w:r>
+      <w:r>
+        <w:rPr>
+          <w:rFonts w:eastAsia="Arial" w:cs="Arial"/>
+          <w:sz w:val="20"/>
+          <w:szCs w:val="20"/>
+          <w:color w:val="292D32"/>
+        </w:rPr>
+        <w:t xml:space="preserve">; Biswas, P.; O’Bannon, B.; Powers, D. C.</w:t>
       </w:r>
       <w:r>
         <w:rPr>
@@ -1991,22 +2293,22 @@
       <w:r>
         <w:rPr>
           <w:rFonts w:eastAsia="Arial" w:cs="Arial"/>
-          <w:i/>
+          <w:i w:val="1"/>
           <w:iCs/>
           <w:sz w:val="20"/>
           <w:szCs w:val="20"/>
           <w:color w:val="292D32"/>
         </w:rPr>
-        <w:t>N</w:t>
-      </w:r>
-      <w:r>
-        <w:rPr>
-          <w:rFonts w:eastAsia="Arial" w:cs="Arial"/>
-          <w:sz w:val="20"/>
-          <w:szCs w:val="20"/>
-          <w:color w:val="292D32"/>
-        </w:rPr>
-        <w:t>-Pyridinium Aziridines</w:t>
+        <w:t xml:space="preserve">N</w:t>
+      </w:r>
+      <w:r>
+        <w:rPr>
+          <w:rFonts w:eastAsia="Arial" w:cs="Arial"/>
+          <w:sz w:val="20"/>
+          <w:szCs w:val="20"/>
+          <w:color w:val="292D32"/>
+        </w:rPr>
+        <w:t xml:space="preserve">-Pyridinium Aziridines</w:t>
       </w:r>
       <w:r>
         <w:rPr>
@@ -2033,37 +2335,28 @@
           <w:rPr>
             <w:rStyle w:val="Hyperlink"/>
             <w:rFonts w:eastAsia="Arial" w:cs="Arial"/>
-            <w:i/>
+            <w:i w:val="1"/>
             <w:iCs/>
             <w:sz w:val="20"/>
             <w:szCs w:val="20"/>
             <w:color w:val="292D32"/>
+            <w:u w:val="none"/>
           </w:rPr>
-          <w:t>Angew</w:t>
+          <w:t xml:space="preserve">Angew</w:t>
         </w:r>
         <w:proofErr w:type="spellEnd"/>
         <w:r>
           <w:rPr>
             <w:rStyle w:val="Hyperlink"/>
             <w:rFonts w:eastAsia="Arial" w:cs="Arial"/>
-            <w:i/>
+            <w:i w:val="1"/>
             <w:iCs/>
             <w:sz w:val="20"/>
             <w:szCs w:val="20"/>
             <w:color w:val="292D32"/>
+            <w:u w:val="none"/>
           </w:rPr>
-          <w:t xml:space="preserve">. Chem. Int. Ed., </w:t>
-        </w:r>
-        <w:r>
-          <w:rPr>
-            <w:rStyle w:val="Hyperlink"/>
-            <w:rFonts w:eastAsia="Arial" w:cs="Arial"/>
-            <w:bCs/>
-            <w:sz w:val="20"/>
-            <w:szCs w:val="20"/>
-            <w:color w:val="292D32"/>
-          </w:rPr>
-          <w:t>2024</w:t>
+          <w:t xml:space="preserve">. Chem. Int. Ed.</w:t>
         </w:r>
         <w:r>
           <w:rPr>
@@ -2075,7 +2368,47 @@
             <w:szCs w:val="20"/>
             <w:color w:val="292D32"/>
           </w:rPr>
-          <w:t>, 63</w:t>
+          <w:t xml:space="preserve">, </w:t>
+        </w:r>
+        <w:r>
+          <w:rPr>
+            <w:rStyle w:val="Hyperlink"/>
+            <w:rFonts w:eastAsia="Arial" w:cs="Arial"/>
+            <w:bCs/>
+            <w:sz w:val="20"/>
+            <w:szCs w:val="20"/>
+            <w:color w:val="292D32"/>
+            <w:b w:val="1"/>
+            <w:i w:val="0"/>
+            <w:u w:val="none"/>
+          </w:rPr>
+          <w:t xml:space="preserve">2024</w:t>
+        </w:r>
+        <w:r>
+          <w:rPr>
+            <w:rStyle w:val="Hyperlink"/>
+            <w:rFonts w:eastAsia="Arial" w:cs="Arial"/>
+            <w:i/>
+            <w:iCs/>
+            <w:sz w:val="20"/>
+            <w:szCs w:val="20"/>
+            <w:color w:val="292D32"/>
+          </w:rPr>
+          <w:t xml:space="preserve">, </w:t>
+        </w:r>
+        <w:r>
+          <w:rPr>
+            <w:rStyle w:val="Hyperlink"/>
+            <w:rFonts w:eastAsia="Arial" w:cs="Arial"/>
+            <w:i w:val="1"/>
+            <w:iCs/>
+            <w:sz w:val="20"/>
+            <w:szCs w:val="20"/>
+            <w:color w:val="292D32"/>
+            <w:b w:val="0"/>
+            <w:u w:val="none"/>
+          </w:rPr>
+          <w:t xml:space="preserve">63</w:t>
         </w:r>
         <w:r>
           <w:rPr>
@@ -2085,7 +2418,7 @@
             <w:szCs w:val="20"/>
             <w:color w:val="292D32"/>
           </w:rPr>
-          <w:t>,</w:t>
+          <w:t xml:space="preserve">,</w:t>
         </w:r>
         <w:r>
           <w:rPr>
@@ -2107,7 +2440,7 @@
             <w:szCs w:val="20"/>
             <w:color w:val="292D32"/>
           </w:rPr>
-          <w:t>e202406335</w:t>
+          <w:t xml:space="preserve">e202406335</w:t>
         </w:r>
       </w:hyperlink>
       <w:r>
@@ -2127,7 +2460,7 @@
           <w:szCs w:val="20"/>
           <w:color w:val="292D32"/>
         </w:rPr>
-        <w:t>Hot paper</w:t>
+        <w:t xml:space="preserve">Hot paper</w:t>
       </w:r>
       <w:r>
         <w:rPr>
@@ -2148,7 +2481,33 @@
           <w:szCs w:val="20"/>
           <w:color w:val="292D32"/>
         </w:rPr>
-        <w:t>Top viewed article in 2025.</w:t>
+        <w:t xml:space="preserve">Top viewed article in </w:t>
+      </w:r>
+      <w:r>
+        <w:rPr>
+          <w:rFonts w:eastAsia="Arial" w:cs="Arial"/>
+          <w:bCs/>
+          <w:i w:val="0"/>
+          <w:iCs/>
+          <w:sz w:val="20"/>
+          <w:szCs w:val="20"/>
+          <w:color w:val="292D32"/>
+          <w:b w:val="1"/>
+          <w:u w:val="none"/>
+        </w:rPr>
+        <w:t xml:space="preserve">2025</w:t>
+      </w:r>
+      <w:r>
+        <w:rPr>
+          <w:rFonts w:eastAsia="Arial" w:cs="Arial"/>
+          <w:bCs/>
+          <w:i/>
+          <w:iCs/>
+          <w:sz w:val="20"/>
+          <w:szCs w:val="20"/>
+          <w:color w:val="292D32"/>
+        </w:rPr>
+        <w:t xml:space="preserve">.</w:t>
       </w:r>
     </w:p>
     <w:p>
@@ -2184,7 +2543,7 @@
           <w:szCs w:val="20"/>
           <w:color w:val="292D32"/>
         </w:rPr>
-        <w:t>Samanta, S.</w:t>
+        <w:t xml:space="preserve">Samanta, S.</w:t>
       </w:r>
       <w:r>
         <w:rPr>
@@ -2194,6 +2553,17 @@
           <w:color w:val="292D32"/>
         </w:rPr>
         <w:t xml:space="preserve">; Maity, A.; Roychowdhury, P. Powers, D. C. </w:t>
+      </w:r>
+      <w:r>
+        <w:rPr>
+          <w:rFonts w:eastAsia="Arial" w:cs="Arial"/>
+          <w:i w:val="1"/>
+          <w:iCs/>
+          <w:sz w:val="20"/>
+          <w:szCs w:val="20"/>
+          <w:color w:val="292D32"/>
+        </w:rPr>
+        <w:t xml:space="preserve">N</w:t>
       </w:r>
       <w:r>
         <w:rPr>
@@ -2204,7 +2574,7 @@
           <w:szCs w:val="20"/>
           <w:color w:val="292D32"/>
         </w:rPr>
-        <w:t>N-</w:t>
+        <w:t xml:space="preserve">-</w:t>
       </w:r>
       <w:r>
         <w:rPr>
@@ -2218,22 +2588,22 @@
       <w:r>
         <w:rPr>
           <w:rFonts w:eastAsia="Arial" w:cs="Arial"/>
-          <w:i/>
+          <w:i w:val="1"/>
           <w:iCs/>
           <w:sz w:val="20"/>
           <w:szCs w:val="20"/>
           <w:color w:val="292D32"/>
         </w:rPr>
-        <w:t>N</w:t>
-      </w:r>
-      <w:r>
-        <w:rPr>
-          <w:rFonts w:eastAsia="Arial" w:cs="Arial"/>
-          <w:sz w:val="20"/>
-          <w:szCs w:val="20"/>
-          <w:color w:val="292D32"/>
-        </w:rPr>
-        <w:t>-Aryl Aziridines.</w:t>
+        <w:t xml:space="preserve">N</w:t>
+      </w:r>
+      <w:r>
+        <w:rPr>
+          <w:rFonts w:eastAsia="Arial" w:cs="Arial"/>
+          <w:sz w:val="20"/>
+          <w:szCs w:val="20"/>
+          <w:color w:val="292D32"/>
+        </w:rPr>
+        <w:t xml:space="preserve">-Aryl Aziridines.</w:t>
       </w:r>
       <w:r>
         <w:rPr>
@@ -2251,13 +2621,14 @@
           <w:rPr>
             <w:rStyle w:val="Hyperlink"/>
             <w:rFonts w:eastAsia="Arial" w:cs="Arial"/>
-            <w:i/>
+            <w:i w:val="1"/>
             <w:iCs/>
             <w:sz w:val="20"/>
             <w:szCs w:val="20"/>
             <w:color w:val="292D32"/>
+            <w:u w:val="none"/>
           </w:rPr>
-          <w:t>Nat. Commun.</w:t>
+          <w:t xml:space="preserve">Nat. Commun.</w:t>
         </w:r>
         <w:r>
           <w:rPr>
@@ -2281,8 +2652,11 @@
             <w:szCs w:val="20"/>
             <w:lang w:val="de-DE"/>
             <w:color w:val="292D32"/>
+            <w:b w:val="1"/>
+            <w:i w:val="0"/>
+            <w:u w:val="none"/>
           </w:rPr>
-          <w:t>2022</w:t>
+          <w:t xml:space="preserve">2022</w:t>
         </w:r>
         <w:r>
           <w:rPr>
@@ -2299,6 +2673,21 @@
           <w:rPr>
             <w:rStyle w:val="Hyperlink"/>
             <w:rFonts w:eastAsia="Arial" w:cs="Arial"/>
+            <w:i w:val="1"/>
+            <w:iCs/>
+            <w:sz w:val="20"/>
+            <w:szCs w:val="20"/>
+            <w:lang w:val="de-DE"/>
+            <w:color w:val="292D32"/>
+            <w:b w:val="0"/>
+            <w:u w:val="none"/>
+          </w:rPr>
+          <w:t xml:space="preserve">13</w:t>
+        </w:r>
+        <w:r>
+          <w:rPr>
+            <w:rStyle w:val="Hyperlink"/>
+            <w:rFonts w:eastAsia="Arial" w:cs="Arial"/>
             <w:i/>
             <w:iCs/>
             <w:sz w:val="20"/>
@@ -2306,7 +2695,7 @@
             <w:lang w:val="de-DE"/>
             <w:color w:val="292D32"/>
           </w:rPr>
-          <w:t xml:space="preserve">13, </w:t>
+          <w:t xml:space="preserve">, </w:t>
         </w:r>
         <w:r>
           <w:rPr>
@@ -2317,7 +2706,7 @@
             <w:lang w:val="de-DE"/>
             <w:color w:val="292D32"/>
           </w:rPr>
-          <w:t>3341</w:t>
+          <w:t xml:space="preserve">3341</w:t>
         </w:r>
         <w:r>
           <w:rPr>
@@ -2327,7 +2716,7 @@
             <w:szCs w:val="20"/>
             <w:color w:val="292D32"/>
           </w:rPr>
-          <w:t>.</w:t>
+          <w:t xml:space="preserve">.</w:t>
         </w:r>
       </w:hyperlink>
       <w:r>
@@ -2349,7 +2738,7 @@
           <w:szCs w:val="20"/>
           <w:color w:val="292D32"/>
         </w:rPr>
-        <w:t>Synform</w:t>
+        <w:t xml:space="preserve">Synform</w:t>
       </w:r>
       <w:proofErr w:type="spellEnd"/>
       <w:r>
@@ -2368,17 +2757,20 @@
           <w:sz w:val="20"/>
           <w:szCs w:val="20"/>
           <w:color w:val="292D32"/>
-        </w:rPr>
-        <w:t>2022</w:t>
-      </w:r>
-      <w:r>
-        <w:rPr>
-          <w:rFonts w:eastAsia="Arial" w:cs="Arial"/>
-          <w:sz w:val="20"/>
-          <w:szCs w:val="20"/>
-          <w:color w:val="292D32"/>
-        </w:rPr>
-        <w:t>/11, A169–A171 as literature coverage.</w:t>
+          <w:b w:val="1"/>
+          <w:i w:val="0"/>
+          <w:u w:val="none"/>
+        </w:rPr>
+        <w:t xml:space="preserve">2022</w:t>
+      </w:r>
+      <w:r>
+        <w:rPr>
+          <w:rFonts w:eastAsia="Arial" w:cs="Arial"/>
+          <w:sz w:val="20"/>
+          <w:szCs w:val="20"/>
+          <w:color w:val="292D32"/>
+        </w:rPr>
+        <w:t xml:space="preserve">/11, A169–A171 as literature coverage.</w:t>
       </w:r>
     </w:p>
     <w:p>
@@ -2411,7 +2803,7 @@
             <w:szCs w:val="20"/>
             <w:color w:val="292D32"/>
           </w:rPr>
-          <w:t>Google Sc</w:t>
+          <w:t xml:space="preserve">Google Sc</w:t>
         </w:r>
         <w:r>
           <w:rPr>
@@ -2422,7 +2814,7 @@
             <w:szCs w:val="20"/>
             <w:color w:val="292D32"/>
           </w:rPr>
-          <w:t>h</w:t>
+          <w:t xml:space="preserve">h</w:t>
         </w:r>
         <w:r>
           <w:rPr>
@@ -2433,7 +2825,7 @@
             <w:szCs w:val="20"/>
             <w:color w:val="292D32"/>
           </w:rPr>
-          <w:t>olar</w:t>
+          <w:t xml:space="preserve">olar</w:t>
         </w:r>
       </w:hyperlink>
       <w:r>
@@ -2443,7 +2835,7 @@
           <w:szCs w:val="20"/>
           <w:color w:val="292D32"/>
         </w:rPr>
-        <w:t>.</w:t>
+        <w:t xml:space="preserve">.</w:t>
       </w:r>
     </w:p>
     <w:p>
@@ -2479,7 +2871,7 @@
           <w:b/>
           <w:i w:val="0"/>
         </w:rPr>
-        <w:t>SELECTED</w:t>
+        <w:t xml:space="preserve">SELECTED</w:t>
       </w:r>
       <w:r>
         <w:rPr>
@@ -2499,7 +2891,7 @@
           <w:b/>
           <w:i w:val="0"/>
         </w:rPr>
-        <w:t>POSTER PRESENTATIONS</w:t>
+        <w:t xml:space="preserve">POSTER PRESENTATIONS</w:t>
       </w:r>
     </w:p>
     <w:p>
@@ -2525,7 +2917,7 @@
           <w:szCs w:val="20"/>
           <w:color w:val="292D32"/>
         </w:rPr>
-        <w:t>Samanta, S.</w:t>
+        <w:t xml:space="preserve">Samanta, S.</w:t>
       </w:r>
       <w:r>
         <w:rPr>
@@ -2545,7 +2937,7 @@
           <w:szCs w:val="20"/>
           <w:color w:val="292D32"/>
         </w:rPr>
-        <w:t>Base-Free, Cross-Electrophile C–N Coupling with Exclusive Cross-Selectivity.</w:t>
+        <w:t xml:space="preserve">Base-Free, Cross-Electrophile C–N Coupling with Exclusive Cross-Selectivity.</w:t>
       </w:r>
       <w:r>
         <w:rPr>
@@ -2572,7 +2964,7 @@
           <w:szCs w:val="20"/>
           <w:color w:val="292D32"/>
         </w:rPr>
-        <w:t>Gordon Research Conference on Organic Reactions and Processes</w:t>
+        <w:t xml:space="preserve">Gordon Research Conference on Organic Reactions and Processes</w:t>
       </w:r>
       <w:r>
         <w:rPr>
@@ -2596,7 +2988,7 @@
           <w:sz w:val="20"/>
           <w:szCs w:val="20"/>
         </w:rPr>
-        <w:t>July 2025</w:t>
+        <w:t xml:space="preserve">July 2025</w:t>
       </w:r>
     </w:p>
     <w:p>
@@ -2622,16 +3014,16 @@
           <w:szCs w:val="20"/>
           <w:color w:val="292D32"/>
         </w:rPr>
-        <w:t>Samanta, S.</w:t>
-      </w:r>
-      <w:r>
-        <w:rPr>
-          <w:rFonts w:eastAsia="Arial" w:cs="Arial"/>
-          <w:sz w:val="20"/>
-          <w:szCs w:val="20"/>
-          <w:color w:val="292D32"/>
-        </w:rPr>
-        <w:t>; Powers, D. C. “</w:t>
+        <w:t xml:space="preserve">Samanta, S.</w:t>
+      </w:r>
+      <w:r>
+        <w:rPr>
+          <w:rFonts w:eastAsia="Arial" w:cs="Arial"/>
+          <w:sz w:val="20"/>
+          <w:szCs w:val="20"/>
+          <w:color w:val="292D32"/>
+        </w:rPr>
+        <w:t xml:space="preserve">; Powers, D. C. “</w:t>
       </w:r>
       <w:r>
         <w:rPr>
@@ -2653,30 +3045,52 @@
           <w:szCs w:val="20"/>
           <w:color w:val="292D32"/>
         </w:rPr>
-        <w:t>-Phenethylamine Synthesis: N-Pyridinium Aziridines</w:t>
-      </w:r>
-      <w:r>
-        <w:rPr>
-          <w:rFonts w:eastAsia="Arial" w:cs="Arial"/>
-          <w:bCs/>
+        <w:t xml:space="preserve">-Phenethylamine Synthesis: </w:t>
+      </w:r>
+      <w:r>
+        <w:rPr>
+          <w:rFonts w:eastAsia="Arial" w:cs="Arial"/>
+          <w:i w:val="1"/>
+          <w:iCs/>
+          <w:sz w:val="20"/>
+          <w:szCs w:val="20"/>
+          <w:color w:val="292D32"/>
+        </w:rPr>
+        <w:t xml:space="preserve">N</w:t>
+      </w:r>
+      <w:r>
+        <w:rPr>
+          <w:rFonts w:eastAsia="Arial" w:cs="Arial"/>
           <w:i/>
           <w:iCs/>
           <w:sz w:val="20"/>
           <w:szCs w:val="20"/>
           <w:color w:val="292D32"/>
         </w:rPr>
-        <w:t xml:space="preserve"> </w:t>
-      </w:r>
-      <w:r>
-        <w:rPr>
-          <w:rFonts w:eastAsia="Arial" w:cs="Arial"/>
+        <w:t xml:space="preserve">-Pyridinium Aziridines</w:t>
+      </w:r>
+      <w:r>
+        <w:rPr>
+          <w:rFonts w:eastAsia="Arial" w:cs="Arial"/>
+          <w:bCs/>
           <w:i/>
           <w:iCs/>
           <w:sz w:val="20"/>
           <w:szCs w:val="20"/>
           <w:color w:val="292D32"/>
         </w:rPr>
-        <w:t>as Latent Dual Electrophiles.</w:t>
+        <w:t xml:space="preserve"> </w:t>
+      </w:r>
+      <w:r>
+        <w:rPr>
+          <w:rFonts w:eastAsia="Arial" w:cs="Arial"/>
+          <w:i/>
+          <w:iCs/>
+          <w:sz w:val="20"/>
+          <w:szCs w:val="20"/>
+          <w:color w:val="292D32"/>
+        </w:rPr>
+        <w:t xml:space="preserve">as Latent Dual Electrophiles.</w:t>
       </w:r>
       <w:r>
         <w:rPr>
@@ -2720,7 +3134,7 @@
           <w:szCs w:val="20"/>
           <w:color w:val="292D32"/>
         </w:rPr>
-        <w:t>on ‘Frontiers in Molecular Catalysis’</w:t>
+        <w:t xml:space="preserve">on ‘Frontiers in Molecular Catalysis’</w:t>
       </w:r>
       <w:r>
         <w:rPr>
@@ -2744,7 +3158,7 @@
           <w:sz w:val="20"/>
           <w:szCs w:val="20"/>
         </w:rPr>
-        <w:t>Oct 2024</w:t>
+        <w:t xml:space="preserve">Oct 2024</w:t>
       </w:r>
     </w:p>
     <w:p>
@@ -2779,7 +3193,7 @@
           <w:szCs w:val="20"/>
           <w:color w:val="292D32"/>
         </w:rPr>
-        <w:t>by ACS Division of Organic Chemistry at Virginia</w:t>
+        <w:t xml:space="preserve">by ACS Division of Organic Chemistry at Virginia</w:t>
       </w:r>
       <w:r>
         <w:rPr>
@@ -2803,7 +3217,7 @@
           <w:sz w:val="20"/>
           <w:szCs w:val="20"/>
         </w:rPr>
-        <w:t>July 2024</w:t>
+        <w:t xml:space="preserve">July 2024</w:t>
       </w:r>
     </w:p>
     <w:p>
@@ -2829,16 +3243,16 @@
           <w:szCs w:val="20"/>
           <w:color w:val="292D32"/>
         </w:rPr>
-        <w:t>Samanta, S.</w:t>
-      </w:r>
-      <w:r>
-        <w:rPr>
-          <w:rFonts w:eastAsia="Arial" w:cs="Arial"/>
-          <w:sz w:val="20"/>
-          <w:szCs w:val="20"/>
-          <w:color w:val="292D32"/>
-        </w:rPr>
-        <w:t>; Powers, D. C. “</w:t>
+        <w:t xml:space="preserve">Samanta, S.</w:t>
+      </w:r>
+      <w:r>
+        <w:rPr>
+          <w:rFonts w:eastAsia="Arial" w:cs="Arial"/>
+          <w:sz w:val="20"/>
+          <w:szCs w:val="20"/>
+          <w:color w:val="292D32"/>
+        </w:rPr>
+        <w:t xml:space="preserve">; Powers, D. C. “</w:t>
       </w:r>
       <w:r>
         <w:rPr>
@@ -2849,16 +3263,38 @@
           <w:szCs w:val="20"/>
           <w:color w:val="292D32"/>
         </w:rPr>
-        <w:t>Development of 1,2-Aminofunctionalized Library from N-Pyridinium Aziridines.</w:t>
-      </w:r>
-      <w:r>
-        <w:rPr>
-          <w:rFonts w:eastAsia="Arial" w:cs="Arial"/>
-          <w:sz w:val="20"/>
-          <w:szCs w:val="20"/>
-          <w:color w:val="292D32"/>
-        </w:rPr>
-        <w:t>”</w:t>
+        <w:t xml:space="preserve">Development of 1,2-Aminofunctionalized Library from </w:t>
+      </w:r>
+      <w:r>
+        <w:rPr>
+          <w:rFonts w:eastAsia="Arial" w:cs="Arial"/>
+          <w:i w:val="1"/>
+          <w:iCs/>
+          <w:sz w:val="20"/>
+          <w:szCs w:val="20"/>
+          <w:color w:val="292D32"/>
+        </w:rPr>
+        <w:t xml:space="preserve">N</w:t>
+      </w:r>
+      <w:r>
+        <w:rPr>
+          <w:rFonts w:eastAsia="Arial" w:cs="Arial"/>
+          <w:i/>
+          <w:iCs/>
+          <w:sz w:val="20"/>
+          <w:szCs w:val="20"/>
+          <w:color w:val="292D32"/>
+        </w:rPr>
+        <w:t xml:space="preserve">-Pyridinium Aziridines.</w:t>
+      </w:r>
+      <w:r>
+        <w:rPr>
+          <w:rFonts w:eastAsia="Arial" w:cs="Arial"/>
+          <w:sz w:val="20"/>
+          <w:szCs w:val="20"/>
+          <w:color w:val="292D32"/>
+        </w:rPr>
+        <w:t xml:space="preserve">”</w:t>
       </w:r>
       <w:r>
         <w:rPr>
@@ -2906,7 +3342,7 @@
           <w:szCs w:val="20"/>
           <w:color w:val="292D32"/>
         </w:rPr>
-        <w:t>TexSyn</w:t>
+        <w:t xml:space="preserve">TexSyn</w:t>
       </w:r>
       <w:proofErr w:type="spellEnd"/>
       <w:r>
@@ -2954,7 +3390,7 @@
           <w:sz w:val="20"/>
           <w:szCs w:val="20"/>
         </w:rPr>
-        <w:t>June 2024</w:t>
+        <w:t xml:space="preserve">June 2024</w:t>
       </w:r>
     </w:p>
     <w:p>
@@ -2980,7 +3416,7 @@
           <w:szCs w:val="20"/>
           <w:color w:val="292D32"/>
         </w:rPr>
-        <w:t>F.A. Cotton Medal for Excellence in Chemical Research Symposium</w:t>
+        <w:t xml:space="preserve">F.A. Cotton Medal for Excellence in Chemical Research Symposium</w:t>
       </w:r>
       <w:r>
         <w:rPr>
@@ -3013,7 +3449,7 @@
           <w:sz w:val="20"/>
           <w:szCs w:val="20"/>
         </w:rPr>
-        <w:t>April 2024</w:t>
+        <w:t xml:space="preserve">April 2024</w:t>
       </w:r>
     </w:p>
     <w:p>
@@ -3039,7 +3475,7 @@
           <w:szCs w:val="20"/>
           <w:color w:val="292D32"/>
         </w:rPr>
-        <w:t>FloHet-2024</w:t>
+        <w:t xml:space="preserve">FloHet-2024</w:t>
       </w:r>
       <w:r>
         <w:rPr>
@@ -3072,7 +3508,7 @@
           <w:sz w:val="20"/>
           <w:szCs w:val="20"/>
         </w:rPr>
-        <w:t>March 2024</w:t>
+        <w:t xml:space="preserve">March 2024</w:t>
       </w:r>
     </w:p>
     <w:p>
@@ -3124,16 +3560,27 @@
           <w:szCs w:val="20"/>
           <w:color w:val="292D32"/>
         </w:rPr>
-        <w:t>Samanta, S.</w:t>
-      </w:r>
-      <w:r>
-        <w:rPr>
-          <w:rFonts w:eastAsia="Arial" w:cs="Arial"/>
-          <w:sz w:val="20"/>
-          <w:szCs w:val="20"/>
-          <w:color w:val="292D32"/>
-        </w:rPr>
-        <w:t>; Powers, D. C. “</w:t>
+        <w:t xml:space="preserve">Samanta, S.</w:t>
+      </w:r>
+      <w:r>
+        <w:rPr>
+          <w:rFonts w:eastAsia="Arial" w:cs="Arial"/>
+          <w:sz w:val="20"/>
+          <w:szCs w:val="20"/>
+          <w:color w:val="292D32"/>
+        </w:rPr>
+        <w:t xml:space="preserve">; Powers, D. C. “</w:t>
+      </w:r>
+      <w:r>
+        <w:rPr>
+          <w:rFonts w:eastAsia="Arial" w:cs="Arial"/>
+          <w:i w:val="1"/>
+          <w:iCs/>
+          <w:sz w:val="20"/>
+          <w:szCs w:val="20"/>
+          <w:color w:val="292D32"/>
+        </w:rPr>
+        <w:t xml:space="preserve">N</w:t>
       </w:r>
       <w:r>
         <w:rPr>
@@ -3144,7 +3591,7 @@
           <w:szCs w:val="20"/>
           <w:color w:val="292D32"/>
         </w:rPr>
-        <w:t>N-Pyridinium Aziridines: Synthesis and Reactivity</w:t>
+        <w:t xml:space="preserve">-Pyridinium Aziridines: Synthesis and Reactivity</w:t>
       </w:r>
       <w:r>
         <w:rPr>
@@ -3163,7 +3610,7 @@
           <w:szCs w:val="20"/>
           <w:color w:val="292D32"/>
         </w:rPr>
-        <w:t>Pfizer Chemistry Connect Virtual Symposium</w:t>
+        <w:t xml:space="preserve">Pfizer Chemistry Connect Virtual Symposium</w:t>
       </w:r>
       <w:r>
         <w:rPr>
@@ -3188,7 +3635,7 @@
           <w:sz w:val="20"/>
           <w:szCs w:val="20"/>
         </w:rPr>
-        <w:t>Nov 2024</w:t>
+        <w:t xml:space="preserve">Nov 2024</w:t>
       </w:r>
     </w:p>
     <w:p>
@@ -3214,16 +3661,16 @@
           <w:szCs w:val="20"/>
           <w:color w:val="292D32"/>
         </w:rPr>
-        <w:t>Samanta, S.</w:t>
-      </w:r>
-      <w:r>
-        <w:rPr>
-          <w:rFonts w:eastAsia="Arial" w:cs="Arial"/>
-          <w:sz w:val="20"/>
-          <w:szCs w:val="20"/>
-          <w:color w:val="292D32"/>
-        </w:rPr>
-        <w:t>; Powers, D. C. “</w:t>
+        <w:t xml:space="preserve">Samanta, S.</w:t>
+      </w:r>
+      <w:r>
+        <w:rPr>
+          <w:rFonts w:eastAsia="Arial" w:cs="Arial"/>
+          <w:sz w:val="20"/>
+          <w:szCs w:val="20"/>
+          <w:color w:val="292D32"/>
+        </w:rPr>
+        <w:t xml:space="preserve">; Powers, D. C. “</w:t>
       </w:r>
       <w:r>
         <w:rPr>
@@ -3245,30 +3692,52 @@
           <w:szCs w:val="20"/>
           <w:color w:val="292D32"/>
         </w:rPr>
-        <w:t>-Phenethylamine Synthesis: N-Pyridinium Aziridines</w:t>
-      </w:r>
-      <w:r>
-        <w:rPr>
-          <w:rFonts w:eastAsia="Arial" w:cs="Arial"/>
-          <w:bCs/>
+        <w:t xml:space="preserve">-Phenethylamine Synthesis: </w:t>
+      </w:r>
+      <w:r>
+        <w:rPr>
+          <w:rFonts w:eastAsia="Arial" w:cs="Arial"/>
+          <w:i w:val="1"/>
+          <w:iCs/>
+          <w:sz w:val="20"/>
+          <w:szCs w:val="20"/>
+          <w:color w:val="292D32"/>
+        </w:rPr>
+        <w:t xml:space="preserve">N</w:t>
+      </w:r>
+      <w:r>
+        <w:rPr>
+          <w:rFonts w:eastAsia="Arial" w:cs="Arial"/>
           <w:i/>
           <w:iCs/>
           <w:sz w:val="20"/>
           <w:szCs w:val="20"/>
           <w:color w:val="292D32"/>
         </w:rPr>
-        <w:t xml:space="preserve"> </w:t>
-      </w:r>
-      <w:r>
-        <w:rPr>
-          <w:rFonts w:eastAsia="Arial" w:cs="Arial"/>
+        <w:t xml:space="preserve">-Pyridinium Aziridines</w:t>
+      </w:r>
+      <w:r>
+        <w:rPr>
+          <w:rFonts w:eastAsia="Arial" w:cs="Arial"/>
+          <w:bCs/>
           <w:i/>
           <w:iCs/>
           <w:sz w:val="20"/>
           <w:szCs w:val="20"/>
           <w:color w:val="292D32"/>
         </w:rPr>
-        <w:t>as Latent Dual Electrophiles.</w:t>
+        <w:t xml:space="preserve"> </w:t>
+      </w:r>
+      <w:r>
+        <w:rPr>
+          <w:rFonts w:eastAsia="Arial" w:cs="Arial"/>
+          <w:i/>
+          <w:iCs/>
+          <w:sz w:val="20"/>
+          <w:szCs w:val="20"/>
+          <w:color w:val="292D32"/>
+        </w:rPr>
+        <w:t xml:space="preserve">as Latent Dual Electrophiles.</w:t>
       </w:r>
       <w:r>
         <w:rPr>
@@ -3287,7 +3756,7 @@
           <w:szCs w:val="20"/>
           <w:color w:val="292D32"/>
         </w:rPr>
-        <w:t>Southwest Regional Meeting of the American Chemical Society</w:t>
+        <w:t xml:space="preserve">Southwest Regional Meeting of the American Chemical Society</w:t>
       </w:r>
       <w:r>
         <w:rPr>
@@ -3312,7 +3781,7 @@
           <w:sz w:val="20"/>
           <w:szCs w:val="20"/>
         </w:rPr>
-        <w:t>Oct 2024</w:t>
+        <w:t xml:space="preserve">Oct 2024</w:t>
       </w:r>
     </w:p>
     <w:p>
@@ -3358,7 +3827,7 @@
           <w:b/>
           <w:i w:val="0"/>
         </w:rPr>
-        <w:t>AWARDS</w:t>
+        <w:t xml:space="preserve">AWARDS</w:t>
       </w:r>
     </w:p>
     <w:p>
@@ -3403,7 +3872,7 @@
           <w:szCs w:val="20"/>
           <w:color w:val="292D32"/>
         </w:rPr>
-        <w:t>74</w:t>
+        <w:t xml:space="preserve">74</w:t>
       </w:r>
       <w:r>
         <w:rPr>
@@ -3414,7 +3883,7 @@
           <w:vertAlign w:val="superscript"/>
           <w:color w:val="292D32"/>
         </w:rPr>
-        <w:t>th</w:t>
+        <w:t xml:space="preserve">th</w:t>
       </w:r>
       <w:r>
         <w:rPr>
@@ -3443,7 +3912,7 @@
           <w:szCs w:val="20"/>
           <w:color w:val="292D32"/>
         </w:rPr>
-        <w:t>in Chemistry</w:t>
+        <w:t xml:space="preserve">in Chemistry</w:t>
       </w:r>
       <w:r>
         <w:rPr>
@@ -3462,27 +3931,27 @@
           <w:szCs w:val="20"/>
           <w:color w:val="292D32"/>
         </w:rPr>
-        <w:t>(</w:t>
-      </w:r>
-      <w:r>
-        <w:rPr>
-          <w:rFonts w:eastAsia="Arial" w:cs="Arial"/>
-          <w:bCs/>
-          <w:sz w:val="20"/>
-          <w:szCs w:val="20"/>
-          <w:color w:val="292D32"/>
-        </w:rPr>
-        <w:t>2025</w:t>
-      </w:r>
-      <w:r>
-        <w:rPr>
-          <w:rFonts w:eastAsia="Arial" w:cs="Arial"/>
-          <w:bCs/>
-          <w:sz w:val="20"/>
-          <w:szCs w:val="20"/>
-          <w:color w:val="292D32"/>
-        </w:rPr>
-        <w:t>)</w:t>
+        <w:t xml:space="preserve">(</w:t>
+      </w:r>
+      <w:r>
+        <w:rPr>
+          <w:rFonts w:eastAsia="Arial" w:cs="Arial"/>
+          <w:bCs/>
+          <w:sz w:val="20"/>
+          <w:szCs w:val="20"/>
+          <w:color w:val="292D32"/>
+        </w:rPr>
+        <w:t xml:space="preserve">2025</w:t>
+      </w:r>
+      <w:r>
+        <w:rPr>
+          <w:rFonts w:eastAsia="Arial" w:cs="Arial"/>
+          <w:bCs/>
+          <w:sz w:val="20"/>
+          <w:szCs w:val="20"/>
+          <w:color w:val="292D32"/>
+        </w:rPr>
+        <w:t xml:space="preserve">)</w:t>
       </w:r>
     </w:p>
     <w:p>
@@ -3509,7 +3978,7 @@
           <w:szCs w:val="20"/>
           <w:color w:val="292D32"/>
         </w:rPr>
-        <w:t>Derek and Christiane Barton Graduate Endowment</w:t>
+        <w:t xml:space="preserve">Derek and Christiane Barton Graduate Endowment</w:t>
       </w:r>
       <w:r>
         <w:rPr>
@@ -3529,17 +3998,17 @@
           <w:szCs w:val="20"/>
           <w:color w:val="292D32"/>
         </w:rPr>
-        <w:t>2025</w:t>
-      </w:r>
-      <w:r>
-        <w:rPr>
-          <w:rFonts w:eastAsia="Arial" w:cs="Arial"/>
-          <w:bCs/>
-          <w:sz w:val="20"/>
-          <w:szCs w:val="20"/>
-          <w:color w:val="292D32"/>
-        </w:rPr>
-        <w:t>)</w:t>
+        <w:t xml:space="preserve">2025</w:t>
+      </w:r>
+      <w:r>
+        <w:rPr>
+          <w:rFonts w:eastAsia="Arial" w:cs="Arial"/>
+          <w:bCs/>
+          <w:sz w:val="20"/>
+          <w:szCs w:val="20"/>
+          <w:color w:val="292D32"/>
+        </w:rPr>
+        <w:t xml:space="preserve">)</w:t>
       </w:r>
     </w:p>
     <w:p>
@@ -3566,7 +4035,7 @@
           <w:szCs w:val="20"/>
           <w:color w:val="292D32"/>
         </w:rPr>
-        <w:t>Sharon Dabney Memorial Scholarship</w:t>
+        <w:t xml:space="preserve">Sharon Dabney Memorial Scholarship</w:t>
       </w:r>
       <w:r>
         <w:rPr>
@@ -3586,17 +4055,17 @@
           <w:szCs w:val="20"/>
           <w:color w:val="292D32"/>
         </w:rPr>
-        <w:t>2025</w:t>
-      </w:r>
-      <w:r>
-        <w:rPr>
-          <w:rFonts w:eastAsia="Arial" w:cs="Arial"/>
-          <w:bCs/>
-          <w:sz w:val="20"/>
-          <w:szCs w:val="20"/>
-          <w:color w:val="292D32"/>
-        </w:rPr>
-        <w:t>)</w:t>
+        <w:t xml:space="preserve">2025</w:t>
+      </w:r>
+      <w:r>
+        <w:rPr>
+          <w:rFonts w:eastAsia="Arial" w:cs="Arial"/>
+          <w:bCs/>
+          <w:sz w:val="20"/>
+          <w:szCs w:val="20"/>
+          <w:color w:val="292D32"/>
+        </w:rPr>
+        <w:t xml:space="preserve">)</w:t>
       </w:r>
     </w:p>
     <w:p>
@@ -3623,7 +4092,7 @@
           <w:szCs w:val="20"/>
           <w:color w:val="292D32"/>
         </w:rPr>
-        <w:t>F. A. Cotton Endowed Memorial Graduate Travel Award</w:t>
+        <w:t xml:space="preserve">F. A. Cotton Endowed Memorial Graduate Travel Award</w:t>
       </w:r>
       <w:r>
         <w:rPr>
@@ -3643,17 +4112,17 @@
           <w:szCs w:val="20"/>
           <w:color w:val="292D32"/>
         </w:rPr>
-        <w:t>2025</w:t>
-      </w:r>
-      <w:r>
-        <w:rPr>
-          <w:rFonts w:eastAsia="Arial" w:cs="Arial"/>
-          <w:bCs/>
-          <w:sz w:val="20"/>
-          <w:szCs w:val="20"/>
-          <w:color w:val="292D32"/>
-        </w:rPr>
-        <w:t>)</w:t>
+        <w:t xml:space="preserve">2025</w:t>
+      </w:r>
+      <w:r>
+        <w:rPr>
+          <w:rFonts w:eastAsia="Arial" w:cs="Arial"/>
+          <w:bCs/>
+          <w:sz w:val="20"/>
+          <w:szCs w:val="20"/>
+          <w:color w:val="292D32"/>
+        </w:rPr>
+        <w:t xml:space="preserve">)</w:t>
       </w:r>
     </w:p>
     <w:p>
@@ -3680,7 +4149,7 @@
           <w:szCs w:val="20"/>
           <w:color w:val="292D32"/>
         </w:rPr>
-        <w:t>Graduate Student Research and Presentation (RAP) Travel Award</w:t>
+        <w:t xml:space="preserve">Graduate Student Research and Presentation (RAP) Travel Award</w:t>
       </w:r>
       <w:r>
         <w:rPr>
@@ -3699,7 +4168,7 @@
           <w:szCs w:val="20"/>
           <w:color w:val="292D32"/>
         </w:rPr>
-        <w:t>(2025)</w:t>
+        <w:t xml:space="preserve">(2025)</w:t>
       </w:r>
     </w:p>
     <w:p>
@@ -3726,7 +4195,7 @@
           <w:szCs w:val="20"/>
           <w:color w:val="292D32"/>
         </w:rPr>
-        <w:t>3</w:t>
+        <w:t xml:space="preserve">3</w:t>
       </w:r>
       <w:r>
         <w:rPr>
@@ -3737,7 +4206,7 @@
           <w:vertAlign w:val="superscript"/>
           <w:color w:val="292D32"/>
         </w:rPr>
-        <w:t>rd</w:t>
+        <w:t xml:space="preserve">rd</w:t>
       </w:r>
       <w:r>
         <w:rPr>
@@ -3785,27 +4254,27 @@
           <w:szCs w:val="20"/>
           <w:color w:val="292D32"/>
         </w:rPr>
-        <w:t>(</w:t>
-      </w:r>
-      <w:r>
-        <w:rPr>
-          <w:rFonts w:eastAsia="Arial" w:cs="Arial"/>
-          <w:bCs/>
-          <w:sz w:val="20"/>
-          <w:szCs w:val="20"/>
-          <w:color w:val="292D32"/>
-        </w:rPr>
-        <w:t>2024</w:t>
-      </w:r>
-      <w:r>
-        <w:rPr>
-          <w:rFonts w:eastAsia="Arial" w:cs="Arial"/>
-          <w:bCs/>
-          <w:sz w:val="20"/>
-          <w:szCs w:val="20"/>
-          <w:color w:val="292D32"/>
-        </w:rPr>
-        <w:t>)</w:t>
+        <w:t xml:space="preserve">(</w:t>
+      </w:r>
+      <w:r>
+        <w:rPr>
+          <w:rFonts w:eastAsia="Arial" w:cs="Arial"/>
+          <w:bCs/>
+          <w:sz w:val="20"/>
+          <w:szCs w:val="20"/>
+          <w:color w:val="292D32"/>
+        </w:rPr>
+        <w:t xml:space="preserve">2024</w:t>
+      </w:r>
+      <w:r>
+        <w:rPr>
+          <w:rFonts w:eastAsia="Arial" w:cs="Arial"/>
+          <w:bCs/>
+          <w:sz w:val="20"/>
+          <w:szCs w:val="20"/>
+          <w:color w:val="292D32"/>
+        </w:rPr>
+        <w:t xml:space="preserve">)</w:t>
       </w:r>
     </w:p>
     <w:p>
@@ -3832,7 +4301,7 @@
           <w:szCs w:val="20"/>
           <w:color w:val="292D32"/>
         </w:rPr>
-        <w:t>Grand Prize for the best poster</w:t>
+        <w:t xml:space="preserve">Grand Prize for the best poster</w:t>
       </w:r>
       <w:r>
         <w:rPr>
@@ -3851,17 +4320,17 @@
           <w:szCs w:val="20"/>
           <w:color w:val="292D32"/>
         </w:rPr>
-        <w:t>Joint Research Symposium</w:t>
-      </w:r>
-      <w:r>
-        <w:rPr>
-          <w:rFonts w:eastAsia="Arial" w:cs="Arial"/>
-          <w:bCs/>
-          <w:sz w:val="20"/>
-          <w:szCs w:val="20"/>
-          <w:color w:val="292D32"/>
-        </w:rPr>
-        <w:t>,</w:t>
+        <w:t xml:space="preserve">Joint Research Symposium</w:t>
+      </w:r>
+      <w:r>
+        <w:rPr>
+          <w:rFonts w:eastAsia="Arial" w:cs="Arial"/>
+          <w:bCs/>
+          <w:sz w:val="20"/>
+          <w:szCs w:val="20"/>
+          <w:color w:val="292D32"/>
+        </w:rPr>
+        <w:t xml:space="preserve">,</w:t>
       </w:r>
       <w:r>
         <w:rPr>
@@ -3891,16 +4360,16 @@
           <w:szCs w:val="20"/>
           <w:color w:val="292D32"/>
         </w:rPr>
-        <w:t>2023</w:t>
-      </w:r>
-      <w:r>
-        <w:rPr>
-          <w:rFonts w:eastAsia="Arial" w:cs="Arial"/>
-          <w:sz w:val="20"/>
-          <w:szCs w:val="20"/>
-          <w:color w:val="292D32"/>
-        </w:rPr>
-        <w:t>)</w:t>
+        <w:t xml:space="preserve">2023</w:t>
+      </w:r>
+      <w:r>
+        <w:rPr>
+          <w:rFonts w:eastAsia="Arial" w:cs="Arial"/>
+          <w:sz w:val="20"/>
+          <w:szCs w:val="20"/>
+          <w:color w:val="292D32"/>
+        </w:rPr>
+        <w:t xml:space="preserve">)</w:t>
       </w:r>
     </w:p>
     <w:p>
@@ -3937,7 +4406,7 @@
           <w:szCs w:val="20"/>
           <w:color w:val="292D32"/>
         </w:rPr>
-        <w:t>(2023)</w:t>
+        <w:t xml:space="preserve">(2023)</w:t>
       </w:r>
     </w:p>
     <w:p>
@@ -3999,7 +4468,7 @@
           <w:szCs w:val="20"/>
           <w:color w:val="292D32"/>
         </w:rPr>
-        <w:t>(Active member and ex-treasurer)</w:t>
+        <w:t xml:space="preserve">(Active member and ex-treasurer)</w:t>
       </w:r>
       <w:r>
         <w:rPr>
@@ -4024,7 +4493,7 @@
           <w:sz w:val="20"/>
           <w:szCs w:val="20"/>
         </w:rPr>
-        <w:t>2022 – present</w:t>
+        <w:t xml:space="preserve">2022 – present</w:t>
       </w:r>
     </w:p>
     <w:p>
@@ -4051,7 +4520,7 @@
           <w:szCs w:val="20"/>
           <w:color w:val="292D32"/>
         </w:rPr>
-        <w:t>Served as treasurer and chair of the judiciary board, managing financial operations and supporting the society’s activities.</w:t>
+        <w:t xml:space="preserve">Served as treasurer and chair of the judiciary board, managing financial operations and supporting the society’s activities.</w:t>
       </w:r>
     </w:p>
     <w:p>
@@ -4078,7 +4547,7 @@
           <w:szCs w:val="20"/>
           <w:color w:val="292D32"/>
         </w:rPr>
-        <w:t>Volunteered for Chemistry Open House at Texas A&amp;M University (2022 and 2023) to promote chemistry education and engage the broader Aggie community.</w:t>
+        <w:t xml:space="preserve">Volunteered for Chemistry Open House at Texas A&amp;M University (2022 and 2023) to promote chemistry education and engage the broader Aggie community.</w:t>
       </w:r>
     </w:p>
     <w:p>
@@ -4102,7 +4571,7 @@
           <w:szCs w:val="20"/>
           <w:color w:val="292D32"/>
         </w:rPr>
-        <w:t>ACS Division of Chemical Health and Safety Workshop</w:t>
+        <w:t xml:space="preserve">ACS Division of Chemical Health and Safety Workshop</w:t>
       </w:r>
       <w:r>
         <w:rPr>
@@ -4127,7 +4596,7 @@
           <w:szCs w:val="20"/>
           <w:color w:val="292D32"/>
         </w:rPr>
-        <w:t>(Moderator)</w:t>
+        <w:t xml:space="preserve">(Moderator)</w:t>
       </w:r>
       <w:r>
         <w:rPr>
@@ -4152,7 +4621,7 @@
           <w:sz w:val="20"/>
           <w:szCs w:val="20"/>
         </w:rPr>
-        <w:t>Aug 2023</w:t>
+        <w:t xml:space="preserve">Aug 2023</w:t>
       </w:r>
     </w:p>
     <w:p>
@@ -4179,7 +4648,7 @@
           <w:szCs w:val="20"/>
           <w:color w:val="292D32"/>
         </w:rPr>
-        <w:t>Introduced the RAMP (recognize hazards, assess risk, minimize risk, and prepare for emergencies) paradigm through case studies and interactive discussions to develop effective laboratory safety practices.</w:t>
+        <w:t xml:space="preserve">Introduced the RAMP (recognize hazards, assess risk, minimize risk, and prepare for emergencies) paradigm through case studies and interactive discussions to develop effective laboratory safety practices.</w:t>
       </w:r>
     </w:p>
     <w:p>
@@ -4203,7 +4672,7 @@
           <w:szCs w:val="20"/>
           <w:color w:val="292D32"/>
         </w:rPr>
-        <w:t>Graduate Student Association of Chemistry (GSAC), TAMU</w:t>
+        <w:t xml:space="preserve">Graduate Student Association of Chemistry (GSAC), TAMU</w:t>
       </w:r>
       <w:r>
         <w:rPr>
@@ -4229,7 +4698,7 @@
           <w:szCs w:val="20"/>
           <w:color w:val="292D32"/>
         </w:rPr>
-        <w:t>l</w:t>
+        <w:t xml:space="preserve">l</w:t>
       </w:r>
       <w:r>
         <w:rPr>
@@ -4255,7 +4724,7 @@
           <w:szCs w:val="20"/>
           <w:color w:val="292D32"/>
         </w:rPr>
-        <w:t>r</w:t>
+        <w:t xml:space="preserve">r</w:t>
       </w:r>
       <w:r>
         <w:rPr>
@@ -4268,7 +4737,7 @@
           <w:szCs w:val="20"/>
           <w:color w:val="292D32"/>
         </w:rPr>
-        <w:t>epresentative)</w:t>
+        <w:t xml:space="preserve">epresentative)</w:t>
       </w:r>
       <w:r>
         <w:rPr>
@@ -4294,7 +4763,7 @@
           <w:sz w:val="20"/>
           <w:szCs w:val="20"/>
         </w:rPr>
-        <w:t>2022 – 2023</w:t>
+        <w:t xml:space="preserve">2022 – 2023</w:t>
       </w:r>
     </w:p>
     <w:p>
@@ -4331,17 +4800,17 @@
           <w:szCs w:val="20"/>
           <w:color w:val="292D32"/>
         </w:rPr>
-        <w:t>C</w:t>
-      </w:r>
-      <w:r>
-        <w:rPr>
-          <w:rFonts w:eastAsia="Arial" w:cs="Arial"/>
-          <w:bCs/>
-          <w:sz w:val="20"/>
-          <w:szCs w:val="20"/>
-          <w:color w:val="292D32"/>
-        </w:rPr>
-        <w:t>hemistry department.</w:t>
+        <w:t xml:space="preserve">C</w:t>
+      </w:r>
+      <w:r>
+        <w:rPr>
+          <w:rFonts w:eastAsia="Arial" w:cs="Arial"/>
+          <w:bCs/>
+          <w:sz w:val="20"/>
+          <w:szCs w:val="20"/>
+          <w:color w:val="292D32"/>
+        </w:rPr>
+        <w:t xml:space="preserve">hemistry department.</w:t>
       </w:r>
     </w:p>
     <w:p>
@@ -4378,17 +4847,17 @@
           <w:szCs w:val="20"/>
           <w:color w:val="292D32"/>
         </w:rPr>
-        <w:t>G</w:t>
-      </w:r>
-      <w:r>
-        <w:rPr>
-          <w:rFonts w:eastAsia="Arial" w:cs="Arial"/>
-          <w:bCs/>
-          <w:sz w:val="20"/>
-          <w:szCs w:val="20"/>
-          <w:color w:val="292D32"/>
-        </w:rPr>
-        <w:t>raduate Recruiting Week (2022–2023), facilitating their transition and providing insights into the graduate experience.</w:t>
+        <w:t xml:space="preserve">G</w:t>
+      </w:r>
+      <w:r>
+        <w:rPr>
+          <w:rFonts w:eastAsia="Arial" w:cs="Arial"/>
+          <w:bCs/>
+          <w:sz w:val="20"/>
+          <w:szCs w:val="20"/>
+          <w:color w:val="292D32"/>
+        </w:rPr>
+        <w:t xml:space="preserve">raduate Recruiting Week (2022–2023), facilitating their transition and providing insights into the graduate experience.</w:t>
       </w:r>
     </w:p>
     <w:p>
@@ -4424,7 +4893,7 @@
           <w:szCs w:val="20"/>
           <w:color w:val="292D32"/>
         </w:rPr>
-        <w:t>(Coordinator)</w:t>
+        <w:t xml:space="preserve">(Coordinator)</w:t>
       </w:r>
       <w:r>
         <w:rPr>
@@ -4449,7 +4918,7 @@
           <w:sz w:val="20"/>
           <w:szCs w:val="20"/>
         </w:rPr>
-        <w:t>2018 – 2019</w:t>
+        <w:t xml:space="preserve">2018 – 2019</w:t>
       </w:r>
     </w:p>
     <w:p>
@@ -4475,7 +4944,7 @@
           <w:szCs w:val="20"/>
           <w:color w:val="292D32"/>
         </w:rPr>
-        <w:t>Organized multiple events to promote intellectual property awareness and patent drive in IIT Kharagpur as the bridge between the research labs and industry.</w:t>
+        <w:t xml:space="preserve">Organized multiple events to promote intellectual property awareness and patent drive in IIT Kharagpur as the bridge between the research labs and industry.</w:t>
       </w:r>
     </w:p>
     <w:sectPr>

</xml_diff>